<commit_message>
Tools checklist: show total cost by group instead of phases
Co-Authored-By: Claude Opus 5.5 <noreply@anthropic.com>
Claude-Session: https://claude.ai/code/session_01L79zFsj3j3wYAWjFgWLRux
</commit_message>
<xml_diff>
--- a/docs/SMM_Tools_Checklist.docx
+++ b/docs/SMM_Tools_Checklist.docx
@@ -3748,7 +3748,7 @@
           <w:color w:val="1B2A5E"/>
           <w:sz w:val="22"/>
         </w:rPr>
-        <w:t>C. Total estimated monthly cost (new tools)</w:t>
+        <w:t>C. Total estimated monthly cost (new tools only, all together)</w:t>
       </w:r>
     </w:p>
     <w:tbl>
@@ -3765,7 +3765,7 @@
       <w:tr>
         <w:tc>
           <w:tcPr>
-            <w:tcW w:type="dxa" w:w="1417"/>
+            <w:tcW w:type="dxa" w:w="1701"/>
           </w:tcPr>
           <w:p>
             <w:pPr>
@@ -3781,13 +3781,13 @@
                 <w:b/>
                 <w:sz w:val="16"/>
               </w:rPr>
-              <w:t>Phase</w:t>
+              <w:t>Group</w:t>
             </w:r>
           </w:p>
         </w:tc>
         <w:tc>
           <w:tcPr>
-            <w:tcW w:type="dxa" w:w="6236"/>
+            <w:tcW w:type="dxa" w:w="5953"/>
           </w:tcPr>
           <w:p>
             <w:pPr>
@@ -3803,7 +3803,7 @@
                 <w:b/>
                 <w:sz w:val="16"/>
               </w:rPr>
-              <w:t>Includes</w:t>
+              <w:t>Tools</w:t>
             </w:r>
           </w:p>
         </w:tc>
@@ -3833,7 +3833,7 @@
       <w:tr>
         <w:tc>
           <w:tcPr>
-            <w:tcW w:type="dxa" w:w="1417"/>
+            <w:tcW w:type="dxa" w:w="1701"/>
           </w:tcPr>
           <w:p>
             <w:pPr>
@@ -3843,13 +3843,13 @@
               <w:rPr>
                 <w:sz w:val="16"/>
               </w:rPr>
-              <w:t>Phase 1</w:t>
+              <w:t>AI</w:t>
             </w:r>
           </w:p>
         </w:tc>
         <w:tc>
           <w:tcPr>
-            <w:tcW w:type="dxa" w:w="6236"/>
+            <w:tcW w:type="dxa" w:w="5953"/>
           </w:tcPr>
           <w:p>
             <w:pPr>
@@ -3859,7 +3859,7 @@
               <w:rPr>
                 <w:sz w:val="16"/>
               </w:rPr>
-              <w:t>Claude extra, Grok, OpenAI (research, strategy, calendar, text posts, 24/7 news)</w:t>
+              <w:t>Claude extra usage $40-100, Grok $30-80, OpenAI $20-50</w:t>
             </w:r>
           </w:p>
         </w:tc>
@@ -3883,7 +3883,7 @@
       <w:tr>
         <w:tc>
           <w:tcPr>
-            <w:tcW w:type="dxa" w:w="1417"/>
+            <w:tcW w:type="dxa" w:w="1701"/>
           </w:tcPr>
           <w:p>
             <w:pPr>
@@ -3893,13 +3893,13 @@
               <w:rPr>
                 <w:sz w:val="16"/>
               </w:rPr>
-              <w:t>Phase 2</w:t>
+              <w:t>Design and video</w:t>
             </w:r>
           </w:p>
         </w:tc>
         <w:tc>
           <w:tcPr>
-            <w:tcW w:type="dxa" w:w="6236"/>
+            <w:tcW w:type="dxa" w:w="5953"/>
           </w:tcPr>
           <w:p>
             <w:pPr>
@@ -3909,7 +3909,7 @@
               <w:rPr>
                 <w:sz w:val="16"/>
               </w:rPr>
-              <w:t>+ Placid, Creatomate, Plainly, After Effects, Epidemic Sound, MinIO</w:t>
+              <w:t>Placid $19-39, Creatomate $41-129, Plainly $69-150, After Effects $23</w:t>
             </w:r>
           </w:p>
         </w:tc>
@@ -3925,7 +3925,7 @@
               <w:rPr>
                 <w:sz w:val="16"/>
               </w:rPr>
-              <w:t>$290-655</w:t>
+              <w:t>$152-341</w:t>
             </w:r>
           </w:p>
         </w:tc>
@@ -3933,7 +3933,7 @@
       <w:tr>
         <w:tc>
           <w:tcPr>
-            <w:tcW w:type="dxa" w:w="1417"/>
+            <w:tcW w:type="dxa" w:w="1701"/>
           </w:tcPr>
           <w:p>
             <w:pPr>
@@ -3943,13 +3943,13 @@
               <w:rPr>
                 <w:sz w:val="16"/>
               </w:rPr>
-              <w:t>Phase 3</w:t>
+              <w:t>Music</w:t>
             </w:r>
           </w:p>
         </w:tc>
         <w:tc>
           <w:tcPr>
-            <w:tcW w:type="dxa" w:w="6236"/>
+            <w:tcW w:type="dxa" w:w="5953"/>
           </w:tcPr>
           <w:p>
             <w:pPr>
@@ -3959,7 +3959,7 @@
               <w:rPr>
                 <w:sz w:val="16"/>
               </w:rPr>
-              <w:t>+ platform APIs (free) and X pay-per-use</w:t>
+              <w:t>Epidemic Sound (or free YouTube Audio Library)</w:t>
             </w:r>
           </w:p>
         </w:tc>
@@ -3975,7 +3975,207 @@
               <w:rPr>
                 <w:sz w:val="16"/>
               </w:rPr>
-              <w:t>$295-675</w:t>
+              <w:t>$0-75</w:t>
+            </w:r>
+          </w:p>
+        </w:tc>
+      </w:tr>
+      <w:tr>
+        <w:tc>
+          <w:tcPr>
+            <w:tcW w:type="dxa" w:w="1701"/>
+          </w:tcPr>
+          <w:p>
+            <w:pPr>
+              <w:spacing w:after="0"/>
+            </w:pPr>
+            <w:r>
+              <w:rPr>
+                <w:sz w:val="16"/>
+              </w:rPr>
+              <w:t>Storage</w:t>
+            </w:r>
+          </w:p>
+        </w:tc>
+        <w:tc>
+          <w:tcPr>
+            <w:tcW w:type="dxa" w:w="5953"/>
+          </w:tcPr>
+          <w:p>
+            <w:pPr>
+              <w:spacing w:after="0"/>
+            </w:pPr>
+            <w:r>
+              <w:rPr>
+                <w:sz w:val="16"/>
+              </w:rPr>
+              <w:t>MinIO on Coolify, extra disk and backup</w:t>
+            </w:r>
+          </w:p>
+        </w:tc>
+        <w:tc>
+          <w:tcPr>
+            <w:tcW w:type="dxa" w:w="1984"/>
+          </w:tcPr>
+          <w:p>
+            <w:pPr>
+              <w:spacing w:after="0"/>
+            </w:pPr>
+            <w:r>
+              <w:rPr>
+                <w:sz w:val="16"/>
+              </w:rPr>
+              <w:t>$0-15</w:t>
+            </w:r>
+          </w:p>
+        </w:tc>
+      </w:tr>
+      <w:tr>
+        <w:tc>
+          <w:tcPr>
+            <w:tcW w:type="dxa" w:w="1701"/>
+          </w:tcPr>
+          <w:p>
+            <w:pPr>
+              <w:spacing w:after="0"/>
+            </w:pPr>
+            <w:r>
+              <w:rPr>
+                <w:sz w:val="16"/>
+              </w:rPr>
+              <w:t>Publishing</w:t>
+            </w:r>
+          </w:p>
+        </w:tc>
+        <w:tc>
+          <w:tcPr>
+            <w:tcW w:type="dxa" w:w="5953"/>
+          </w:tcPr>
+          <w:p>
+            <w:pPr>
+              <w:spacing w:after="0"/>
+            </w:pPr>
+            <w:r>
+              <w:rPr>
+                <w:sz w:val="16"/>
+              </w:rPr>
+              <w:t>Meta, LinkedIn, YouTube, Pinterest free; X pay-per-use</w:t>
+            </w:r>
+          </w:p>
+        </w:tc>
+        <w:tc>
+          <w:tcPr>
+            <w:tcW w:type="dxa" w:w="1984"/>
+          </w:tcPr>
+          <w:p>
+            <w:pPr>
+              <w:spacing w:after="0"/>
+            </w:pPr>
+            <w:r>
+              <w:rPr>
+                <w:sz w:val="16"/>
+              </w:rPr>
+              <w:t>$5-20</w:t>
+            </w:r>
+          </w:p>
+        </w:tc>
+      </w:tr>
+      <w:tr>
+        <w:tc>
+          <w:tcPr>
+            <w:tcW w:type="dxa" w:w="1701"/>
+          </w:tcPr>
+          <w:p>
+            <w:pPr>
+              <w:spacing w:after="0"/>
+            </w:pPr>
+            <w:r>
+              <w:rPr>
+                <w:sz w:val="16"/>
+              </w:rPr>
+              <w:t>Free / existing</w:t>
+            </w:r>
+          </w:p>
+        </w:tc>
+        <w:tc>
+          <w:tcPr>
+            <w:tcW w:type="dxa" w:w="5953"/>
+          </w:tcPr>
+          <w:p>
+            <w:pPr>
+              <w:spacing w:after="0"/>
+            </w:pPr>
+            <w:r>
+              <w:rPr>
+                <w:sz w:val="16"/>
+              </w:rPr>
+              <w:t>Unsplash, Fireflies, Zoho, SerpHouse, Google tools, WordPress, Slack, Canva, Coolify</w:t>
+            </w:r>
+          </w:p>
+        </w:tc>
+        <w:tc>
+          <w:tcPr>
+            <w:tcW w:type="dxa" w:w="1984"/>
+          </w:tcPr>
+          <w:p>
+            <w:pPr>
+              <w:spacing w:after="0"/>
+            </w:pPr>
+            <w:r>
+              <w:rPr>
+                <w:sz w:val="16"/>
+              </w:rPr>
+              <w:t>$0 extra</w:t>
+            </w:r>
+          </w:p>
+        </w:tc>
+      </w:tr>
+      <w:tr>
+        <w:tc>
+          <w:tcPr>
+            <w:tcW w:type="dxa" w:w="1701"/>
+          </w:tcPr>
+          <w:p>
+            <w:pPr>
+              <w:spacing w:after="0"/>
+            </w:pPr>
+            <w:r>
+              <w:rPr>
+                <w:sz w:val="16"/>
+              </w:rPr>
+              <w:t>TOTAL</w:t>
+            </w:r>
+          </w:p>
+        </w:tc>
+        <w:tc>
+          <w:tcPr>
+            <w:tcW w:type="dxa" w:w="5953"/>
+          </w:tcPr>
+          <w:p>
+            <w:pPr>
+              <w:spacing w:after="0"/>
+            </w:pPr>
+            <w:r>
+              <w:rPr>
+                <w:sz w:val="16"/>
+              </w:rPr>
+              <w:t>All new tools together</w:t>
+            </w:r>
+          </w:p>
+        </w:tc>
+        <w:tc>
+          <w:tcPr>
+            <w:tcW w:type="dxa" w:w="1984"/>
+          </w:tcPr>
+          <w:p>
+            <w:pPr>
+              <w:spacing w:after="0"/>
+            </w:pPr>
+            <w:r>
+              <w:rPr>
+                <w:sz w:val="16"/>
+              </w:rPr>
+              <w:t>about $250-680</w:t>
             </w:r>
           </w:p>
         </w:tc>

</xml_diff>

<commit_message>
Tools checklist: native platform APIs only for posting
Co-Authored-By: Claude Opus 5.5 <noreply@anthropic.com>
Claude-Session: https://claude.ai/code/session_01L79zFsj3j3wYAWjFgWLRux
</commit_message>
<xml_diff>
--- a/docs/SMM_Tools_Checklist.docx
+++ b/docs/SMM_Tools_Checklist.docx
@@ -17,7 +17,7 @@
     </w:p>
     <w:p>
       <w:r>
-        <w:t>October 2026 · For checking each tool on its official website before buying · Costs are approximate USD per month and may change; confirm on the pricing page.</w:t>
+        <w:t>October 2026 · Posting uses only native platform APIs (no third-party posting tools) · For checking each tool on its official website before buying · Costs are approximate USD per month and may change; confirm on the pricing page.</w:t>
       </w:r>
     </w:p>
     <w:p>
@@ -1190,7 +1190,7 @@
               <w:rPr>
                 <w:sz w:val="16"/>
               </w:rPr>
-              <w:t>Meta Graph API</w:t>
+              <w:t>Meta Graph API + Instagram API + Threads API (native)</w:t>
             </w:r>
           </w:p>
         </w:tc>
@@ -1206,7 +1206,7 @@
               <w:rPr>
                 <w:sz w:val="16"/>
               </w:rPr>
-              <w:t>Facebook, Instagram, Threads: posting, comments, messages</w:t>
+              <w:t>Facebook, Instagram, Threads: posting, stories, reels, comments, messages</w:t>
             </w:r>
           </w:p>
         </w:tc>
@@ -3156,7 +3156,7 @@
               <w:rPr>
                 <w:sz w:val="16"/>
               </w:rPr>
-              <w:t>Publer</w:t>
+              <w:t>Publer, Buffer, Hootsuite and other posting tools</w:t>
             </w:r>
           </w:p>
         </w:tc>
@@ -3172,7 +3172,7 @@
               <w:rPr>
                 <w:sz w:val="16"/>
               </w:rPr>
-              <w:t>Native APIs are free; X now pay-per-use</w:t>
+              <w:t>Policy: posting only through each platform's own native API, no third-party posting tools</w:t>
             </w:r>
           </w:p>
         </w:tc>
@@ -3188,7 +3188,7 @@
               <w:rPr>
                 <w:sz w:val="16"/>
               </w:rPr>
-              <w:t>Native APIs</w:t>
+              <w:t>Native APIs (rows 11-15)</w:t>
             </w:r>
           </w:p>
         </w:tc>
@@ -3204,7 +3204,7 @@
               <w:rPr>
                 <w:sz w:val="16"/>
               </w:rPr>
-              <w:t>publer.com/plans</w:t>
+              <w:t>-</w:t>
             </w:r>
           </w:p>
         </w:tc>

</xml_diff>

<commit_message>
Tools checklist: add Adobe Firefly Services comparison
Co-Authored-By: Claude Opus 5.5 <noreply@anthropic.com>
Claude-Session: https://claude.ai/code/session_01L79zFsj3j3wYAWjFgWLRux
</commit_message>
<xml_diff>
--- a/docs/SMM_Tools_Checklist.docx
+++ b/docs/SMM_Tools_Checklist.docx
@@ -4181,6 +4181,1016 @@
         </w:tc>
       </w:tr>
     </w:tbl>
+    <w:p>
+      <w:pPr>
+        <w:spacing w:before="100" w:after="40"/>
+      </w:pPr>
+      <w:r>
+        <w:rPr>
+          <w:b/>
+          <w:color w:val="1B2A5E"/>
+          <w:sz w:val="22"/>
+        </w:rPr>
+        <w:t>D. Option: Adobe Firefly Services (what it includes, what it replaces, cost)</w:t>
+      </w:r>
+    </w:p>
+    <w:p>
+      <w:r>
+        <w:t>Firefly Services is Adobe's set of creative APIs, sold only under an Adobe enterprise agreement (ETLA). Price is quoted by Adobe sales; third-party estimates suggest about $1,000 per month minimum. Website: developer.adobe.com/firefly-services</w:t>
+      </w:r>
+    </w:p>
+    <w:tbl>
+      <w:tblPr>
+        <w:tblStyle w:val="LightGrid-Accent1"/>
+        <w:tblW w:type="auto" w:w="0"/>
+        <w:tblLook w:firstColumn="1" w:firstRow="1" w:lastColumn="0" w:lastRow="0" w:noHBand="0" w:noVBand="1" w:val="04A0"/>
+      </w:tblPr>
+      <w:tblGrid>
+        <w:gridCol w:w="2635"/>
+        <w:gridCol w:w="2635"/>
+        <w:gridCol w:w="2635"/>
+        <w:gridCol w:w="2635"/>
+      </w:tblGrid>
+      <w:tr>
+        <w:tc>
+          <w:tcPr>
+            <w:tcW w:type="dxa" w:w="2268"/>
+          </w:tcPr>
+          <w:p>
+            <w:pPr>
+              <w:spacing w:after="0"/>
+            </w:pPr>
+            <w:r>
+              <w:rPr>
+                <w:sz w:val="16"/>
+              </w:rPr>
+            </w:r>
+            <w:r>
+              <w:rPr>
+                <w:b/>
+                <w:sz w:val="16"/>
+              </w:rPr>
+              <w:t>Firefly Services API</w:t>
+            </w:r>
+          </w:p>
+        </w:tc>
+        <w:tc>
+          <w:tcPr>
+            <w:tcW w:type="dxa" w:w="3402"/>
+          </w:tcPr>
+          <w:p>
+            <w:pPr>
+              <w:spacing w:after="0"/>
+            </w:pPr>
+            <w:r>
+              <w:rPr>
+                <w:sz w:val="16"/>
+              </w:rPr>
+            </w:r>
+            <w:r>
+              <w:rPr>
+                <w:b/>
+                <w:sz w:val="16"/>
+              </w:rPr>
+              <w:t>Use case for us</w:t>
+            </w:r>
+          </w:p>
+        </w:tc>
+        <w:tc>
+          <w:tcPr>
+            <w:tcW w:type="dxa" w:w="2551"/>
+          </w:tcPr>
+          <w:p>
+            <w:pPr>
+              <w:spacing w:after="0"/>
+            </w:pPr>
+            <w:r>
+              <w:rPr>
+                <w:sz w:val="16"/>
+              </w:rPr>
+            </w:r>
+            <w:r>
+              <w:rPr>
+                <w:b/>
+                <w:sz w:val="16"/>
+              </w:rPr>
+              <w:t>Would replace</w:t>
+            </w:r>
+          </w:p>
+        </w:tc>
+        <w:tc>
+          <w:tcPr>
+            <w:tcW w:type="dxa" w:w="1417"/>
+          </w:tcPr>
+          <w:p>
+            <w:pPr>
+              <w:spacing w:after="0"/>
+            </w:pPr>
+            <w:r>
+              <w:rPr>
+                <w:sz w:val="16"/>
+              </w:rPr>
+            </w:r>
+            <w:r>
+              <w:rPr>
+                <w:b/>
+                <w:sz w:val="16"/>
+              </w:rPr>
+              <w:t>Saving</w:t>
+            </w:r>
+          </w:p>
+        </w:tc>
+      </w:tr>
+      <w:tr>
+        <w:tc>
+          <w:tcPr>
+            <w:tcW w:type="dxa" w:w="2268"/>
+          </w:tcPr>
+          <w:p>
+            <w:pPr>
+              <w:spacing w:after="0"/>
+            </w:pPr>
+            <w:r>
+              <w:rPr>
+                <w:sz w:val="16"/>
+              </w:rPr>
+              <w:t>Firefly API (image generation, fill, expand)</w:t>
+            </w:r>
+          </w:p>
+        </w:tc>
+        <w:tc>
+          <w:tcPr>
+            <w:tcW w:type="dxa" w:w="3402"/>
+          </w:tcPr>
+          <w:p>
+            <w:pPr>
+              <w:spacing w:after="0"/>
+            </w:pPr>
+            <w:r>
+              <w:rPr>
+                <w:sz w:val="16"/>
+              </w:rPr>
+              <w:t>Concept images, backgrounds, edit by prompt; marketed as commercially safe</w:t>
+            </w:r>
+          </w:p>
+        </w:tc>
+        <w:tc>
+          <w:tcPr>
+            <w:tcW w:type="dxa" w:w="2551"/>
+          </w:tcPr>
+          <w:p>
+            <w:pPr>
+              <w:spacing w:after="0"/>
+            </w:pPr>
+            <w:r>
+              <w:rPr>
+                <w:sz w:val="16"/>
+              </w:rPr>
+              <w:t>OpenAI images (we keep OpenAI for second fact check)</w:t>
+            </w:r>
+          </w:p>
+        </w:tc>
+        <w:tc>
+          <w:tcPr>
+            <w:tcW w:type="dxa" w:w="1417"/>
+          </w:tcPr>
+          <w:p>
+            <w:pPr>
+              <w:spacing w:after="0"/>
+            </w:pPr>
+            <w:r>
+              <w:rPr>
+                <w:sz w:val="16"/>
+              </w:rPr>
+              <w:t>$20-50</w:t>
+            </w:r>
+          </w:p>
+        </w:tc>
+      </w:tr>
+      <w:tr>
+        <w:tc>
+          <w:tcPr>
+            <w:tcW w:type="dxa" w:w="2268"/>
+          </w:tcPr>
+          <w:p>
+            <w:pPr>
+              <w:spacing w:after="0"/>
+            </w:pPr>
+            <w:r>
+              <w:rPr>
+                <w:sz w:val="16"/>
+              </w:rPr>
+              <w:t>Photoshop API</w:t>
+            </w:r>
+          </w:p>
+        </w:tc>
+        <w:tc>
+          <w:tcPr>
+            <w:tcW w:type="dxa" w:w="3402"/>
+          </w:tcPr>
+          <w:p>
+            <w:pPr>
+              <w:spacing w:after="0"/>
+            </w:pPr>
+            <w:r>
+              <w:rPr>
+                <w:sz w:val="16"/>
+              </w:rPr>
+              <w:t>Fill PSD brand templates, remove backgrounds, resize for every platform</w:t>
+            </w:r>
+          </w:p>
+        </w:tc>
+        <w:tc>
+          <w:tcPr>
+            <w:tcW w:type="dxa" w:w="2551"/>
+          </w:tcPr>
+          <w:p>
+            <w:pPr>
+              <w:spacing w:after="0"/>
+            </w:pPr>
+            <w:r>
+              <w:rPr>
+                <w:sz w:val="16"/>
+              </w:rPr>
+              <w:t>Placid</w:t>
+            </w:r>
+          </w:p>
+        </w:tc>
+        <w:tc>
+          <w:tcPr>
+            <w:tcW w:type="dxa" w:w="1417"/>
+          </w:tcPr>
+          <w:p>
+            <w:pPr>
+              <w:spacing w:after="0"/>
+            </w:pPr>
+            <w:r>
+              <w:rPr>
+                <w:sz w:val="16"/>
+              </w:rPr>
+              <w:t>$19-39</w:t>
+            </w:r>
+          </w:p>
+        </w:tc>
+      </w:tr>
+      <w:tr>
+        <w:tc>
+          <w:tcPr>
+            <w:tcW w:type="dxa" w:w="2268"/>
+          </w:tcPr>
+          <w:p>
+            <w:pPr>
+              <w:spacing w:after="0"/>
+            </w:pPr>
+            <w:r>
+              <w:rPr>
+                <w:sz w:val="16"/>
+              </w:rPr>
+              <w:t>InDesign API</w:t>
+            </w:r>
+          </w:p>
+        </w:tc>
+        <w:tc>
+          <w:tcPr>
+            <w:tcW w:type="dxa" w:w="3402"/>
+          </w:tcPr>
+          <w:p>
+            <w:pPr>
+              <w:spacing w:after="0"/>
+            </w:pPr>
+            <w:r>
+              <w:rPr>
+                <w:sz w:val="16"/>
+              </w:rPr>
+              <w:t>Multi-page layouts, carousels, PDFs and guides from templates</w:t>
+            </w:r>
+          </w:p>
+        </w:tc>
+        <w:tc>
+          <w:tcPr>
+            <w:tcW w:type="dxa" w:w="2551"/>
+          </w:tcPr>
+          <w:p>
+            <w:pPr>
+              <w:spacing w:after="0"/>
+            </w:pPr>
+            <w:r>
+              <w:rPr>
+                <w:sz w:val="16"/>
+              </w:rPr>
+              <w:t>Placid (carousels)</w:t>
+            </w:r>
+          </w:p>
+        </w:tc>
+        <w:tc>
+          <w:tcPr>
+            <w:tcW w:type="dxa" w:w="1417"/>
+          </w:tcPr>
+          <w:p>
+            <w:pPr>
+              <w:spacing w:after="0"/>
+            </w:pPr>
+            <w:r>
+              <w:rPr>
+                <w:sz w:val="16"/>
+              </w:rPr>
+              <w:t>Included above</w:t>
+            </w:r>
+          </w:p>
+        </w:tc>
+      </w:tr>
+      <w:tr>
+        <w:tc>
+          <w:tcPr>
+            <w:tcW w:type="dxa" w:w="2268"/>
+          </w:tcPr>
+          <w:p>
+            <w:pPr>
+              <w:spacing w:after="0"/>
+            </w:pPr>
+            <w:r>
+              <w:rPr>
+                <w:sz w:val="16"/>
+              </w:rPr>
+              <w:t>Lightroom API</w:t>
+            </w:r>
+          </w:p>
+        </w:tc>
+        <w:tc>
+          <w:tcPr>
+            <w:tcW w:type="dxa" w:w="3402"/>
+          </w:tcPr>
+          <w:p>
+            <w:pPr>
+              <w:spacing w:after="0"/>
+            </w:pPr>
+            <w:r>
+              <w:rPr>
+                <w:sz w:val="16"/>
+              </w:rPr>
+              <w:t>Auto colour and light correction for uploaded event photos</w:t>
+            </w:r>
+          </w:p>
+        </w:tc>
+        <w:tc>
+          <w:tcPr>
+            <w:tcW w:type="dxa" w:w="2551"/>
+          </w:tcPr>
+          <w:p>
+            <w:pPr>
+              <w:spacing w:after="0"/>
+            </w:pPr>
+            <w:r>
+              <w:rPr>
+                <w:sz w:val="16"/>
+              </w:rPr>
+              <w:t>Manual photo editing</w:t>
+            </w:r>
+          </w:p>
+        </w:tc>
+        <w:tc>
+          <w:tcPr>
+            <w:tcW w:type="dxa" w:w="1417"/>
+          </w:tcPr>
+          <w:p>
+            <w:pPr>
+              <w:spacing w:after="0"/>
+            </w:pPr>
+            <w:r>
+              <w:rPr>
+                <w:sz w:val="16"/>
+              </w:rPr>
+              <w:t>$0 (time saving)</w:t>
+            </w:r>
+          </w:p>
+        </w:tc>
+      </w:tr>
+      <w:tr>
+        <w:tc>
+          <w:tcPr>
+            <w:tcW w:type="dxa" w:w="2268"/>
+          </w:tcPr>
+          <w:p>
+            <w:pPr>
+              <w:spacing w:after="0"/>
+            </w:pPr>
+            <w:r>
+              <w:rPr>
+                <w:sz w:val="16"/>
+              </w:rPr>
+              <w:t>Content Tagging API</w:t>
+            </w:r>
+          </w:p>
+        </w:tc>
+        <w:tc>
+          <w:tcPr>
+            <w:tcW w:type="dxa" w:w="3402"/>
+          </w:tcPr>
+          <w:p>
+            <w:pPr>
+              <w:spacing w:after="0"/>
+            </w:pPr>
+            <w:r>
+              <w:rPr>
+                <w:sz w:val="16"/>
+              </w:rPr>
+              <w:t>Auto-tags every file in the Asset Library</w:t>
+            </w:r>
+          </w:p>
+        </w:tc>
+        <w:tc>
+          <w:tcPr>
+            <w:tcW w:type="dxa" w:w="2551"/>
+          </w:tcPr>
+          <w:p>
+            <w:pPr>
+              <w:spacing w:after="0"/>
+            </w:pPr>
+            <w:r>
+              <w:rPr>
+                <w:sz w:val="16"/>
+              </w:rPr>
+              <w:t>Nothing paid (Claude can tag files too)</w:t>
+            </w:r>
+          </w:p>
+        </w:tc>
+        <w:tc>
+          <w:tcPr>
+            <w:tcW w:type="dxa" w:w="1417"/>
+          </w:tcPr>
+          <w:p>
+            <w:pPr>
+              <w:spacing w:after="0"/>
+            </w:pPr>
+            <w:r>
+              <w:rPr>
+                <w:sz w:val="16"/>
+              </w:rPr>
+              <w:t>$0</w:t>
+            </w:r>
+          </w:p>
+        </w:tc>
+      </w:tr>
+      <w:tr>
+        <w:tc>
+          <w:tcPr>
+            <w:tcW w:type="dxa" w:w="2268"/>
+          </w:tcPr>
+          <w:p>
+            <w:pPr>
+              <w:spacing w:after="0"/>
+            </w:pPr>
+            <w:r>
+              <w:rPr>
+                <w:sz w:val="16"/>
+              </w:rPr>
+              <w:t>Audio / Video APIs</w:t>
+            </w:r>
+          </w:p>
+        </w:tc>
+        <w:tc>
+          <w:tcPr>
+            <w:tcW w:type="dxa" w:w="3402"/>
+          </w:tcPr>
+          <w:p>
+            <w:pPr>
+              <w:spacing w:after="0"/>
+            </w:pPr>
+            <w:r>
+              <w:rPr>
+                <w:sz w:val="16"/>
+              </w:rPr>
+              <w:t>Translate, dub and edit clips; AI video clips</w:t>
+            </w:r>
+          </w:p>
+        </w:tc>
+        <w:tc>
+          <w:tcPr>
+            <w:tcW w:type="dxa" w:w="2551"/>
+          </w:tcPr>
+          <w:p>
+            <w:pPr>
+              <w:spacing w:after="0"/>
+            </w:pPr>
+            <w:r>
+              <w:rPr>
+                <w:sz w:val="16"/>
+              </w:rPr>
+              <w:t>Partly the AI video clips only</w:t>
+            </w:r>
+          </w:p>
+        </w:tc>
+        <w:tc>
+          <w:tcPr>
+            <w:tcW w:type="dxa" w:w="1417"/>
+          </w:tcPr>
+          <w:p>
+            <w:pPr>
+              <w:spacing w:after="0"/>
+            </w:pPr>
+            <w:r>
+              <w:rPr>
+                <w:sz w:val="16"/>
+              </w:rPr>
+              <w:t>$0-small</w:t>
+            </w:r>
+          </w:p>
+        </w:tc>
+      </w:tr>
+    </w:tbl>
+    <w:tbl>
+      <w:tblPr>
+        <w:tblStyle w:val="LightGrid-Accent1"/>
+        <w:tblW w:type="auto" w:w="0"/>
+        <w:tblLook w:firstColumn="1" w:firstRow="1" w:lastColumn="0" w:lastRow="0" w:noHBand="0" w:noVBand="1" w:val="04A0"/>
+      </w:tblPr>
+      <w:tblGrid>
+        <w:gridCol w:w="5270"/>
+        <w:gridCol w:w="5270"/>
+      </w:tblGrid>
+      <w:tr>
+        <w:tc>
+          <w:tcPr>
+            <w:tcW w:type="dxa" w:w="3402"/>
+          </w:tcPr>
+          <w:p>
+            <w:pPr>
+              <w:spacing w:after="0"/>
+            </w:pPr>
+            <w:r>
+              <w:rPr>
+                <w:sz w:val="16"/>
+              </w:rPr>
+            </w:r>
+            <w:r>
+              <w:rPr>
+                <w:b/>
+                <w:sz w:val="16"/>
+              </w:rPr>
+              <w:t>What Firefly Services does NOT replace</w:t>
+            </w:r>
+          </w:p>
+        </w:tc>
+        <w:tc>
+          <w:tcPr>
+            <w:tcW w:type="dxa" w:w="6236"/>
+          </w:tcPr>
+          <w:p>
+            <w:pPr>
+              <w:spacing w:after="0"/>
+            </w:pPr>
+            <w:r>
+              <w:rPr>
+                <w:sz w:val="16"/>
+              </w:rPr>
+            </w:r>
+            <w:r>
+              <w:rPr>
+                <w:b/>
+                <w:sz w:val="16"/>
+              </w:rPr>
+              <w:t>Why we still need it</w:t>
+            </w:r>
+          </w:p>
+        </w:tc>
+      </w:tr>
+      <w:tr>
+        <w:tc>
+          <w:tcPr>
+            <w:tcW w:type="dxa" w:w="3402"/>
+          </w:tcPr>
+          <w:p>
+            <w:pPr>
+              <w:spacing w:after="0"/>
+            </w:pPr>
+            <w:r>
+              <w:rPr>
+                <w:sz w:val="16"/>
+              </w:rPr>
+              <w:t>Zoho CRM</w:t>
+            </w:r>
+          </w:p>
+        </w:tc>
+        <w:tc>
+          <w:tcPr>
+            <w:tcW w:type="dxa" w:w="6236"/>
+          </w:tcPr>
+          <w:p>
+            <w:pPr>
+              <w:spacing w:after="0"/>
+            </w:pPr>
+            <w:r>
+              <w:rPr>
+                <w:sz w:val="16"/>
+              </w:rPr>
+              <w:t>Lead tracking and sales pipeline; Firefly has no CRM</w:t>
+            </w:r>
+          </w:p>
+        </w:tc>
+      </w:tr>
+      <w:tr>
+        <w:tc>
+          <w:tcPr>
+            <w:tcW w:type="dxa" w:w="3402"/>
+          </w:tcPr>
+          <w:p>
+            <w:pPr>
+              <w:spacing w:after="0"/>
+            </w:pPr>
+            <w:r>
+              <w:rPr>
+                <w:sz w:val="16"/>
+              </w:rPr>
+              <w:t>Fireflies.ai</w:t>
+            </w:r>
+          </w:p>
+        </w:tc>
+        <w:tc>
+          <w:tcPr>
+            <w:tcW w:type="dxa" w:w="6236"/>
+          </w:tcPr>
+          <w:p>
+            <w:pPr>
+              <w:spacing w:after="0"/>
+            </w:pPr>
+            <w:r>
+              <w:rPr>
+                <w:sz w:val="16"/>
+              </w:rPr>
+              <w:t>Meeting transcripts; different product, not related to Adobe Firefly</w:t>
+            </w:r>
+          </w:p>
+        </w:tc>
+      </w:tr>
+      <w:tr>
+        <w:tc>
+          <w:tcPr>
+            <w:tcW w:type="dxa" w:w="3402"/>
+          </w:tcPr>
+          <w:p>
+            <w:pPr>
+              <w:spacing w:after="0"/>
+            </w:pPr>
+            <w:r>
+              <w:rPr>
+                <w:sz w:val="16"/>
+              </w:rPr>
+              <w:t>Claude, Grok, OpenAI (text)</w:t>
+            </w:r>
+          </w:p>
+        </w:tc>
+        <w:tc>
+          <w:tcPr>
+            <w:tcW w:type="dxa" w:w="6236"/>
+          </w:tcPr>
+          <w:p>
+            <w:pPr>
+              <w:spacing w:after="0"/>
+            </w:pPr>
+            <w:r>
+              <w:rPr>
+                <w:sz w:val="16"/>
+              </w:rPr>
+              <w:t>Research, writing, fact check, trends, replies</w:t>
+            </w:r>
+          </w:p>
+        </w:tc>
+      </w:tr>
+      <w:tr>
+        <w:tc>
+          <w:tcPr>
+            <w:tcW w:type="dxa" w:w="3402"/>
+          </w:tcPr>
+          <w:p>
+            <w:pPr>
+              <w:spacing w:after="0"/>
+            </w:pPr>
+            <w:r>
+              <w:rPr>
+                <w:sz w:val="16"/>
+              </w:rPr>
+              <w:t>Creatomate, Plainly, After Effects</w:t>
+            </w:r>
+          </w:p>
+        </w:tc>
+        <w:tc>
+          <w:tcPr>
+            <w:tcW w:type="dxa" w:w="6236"/>
+          </w:tcPr>
+          <w:p>
+            <w:pPr>
+              <w:spacing w:after="0"/>
+            </w:pPr>
+            <w:r>
+              <w:rPr>
+                <w:sz w:val="16"/>
+              </w:rPr>
+              <w:t>Motion graphics templates and After Effects quality rendering</w:t>
+            </w:r>
+          </w:p>
+        </w:tc>
+      </w:tr>
+      <w:tr>
+        <w:tc>
+          <w:tcPr>
+            <w:tcW w:type="dxa" w:w="3402"/>
+          </w:tcPr>
+          <w:p>
+            <w:pPr>
+              <w:spacing w:after="0"/>
+            </w:pPr>
+            <w:r>
+              <w:rPr>
+                <w:sz w:val="16"/>
+              </w:rPr>
+              <w:t>Epidemic Sound</w:t>
+            </w:r>
+          </w:p>
+        </w:tc>
+        <w:tc>
+          <w:tcPr>
+            <w:tcW w:type="dxa" w:w="6236"/>
+          </w:tcPr>
+          <w:p>
+            <w:pPr>
+              <w:spacing w:after="0"/>
+            </w:pPr>
+            <w:r>
+              <w:rPr>
+                <w:sz w:val="16"/>
+              </w:rPr>
+              <w:t>Licensed music library</w:t>
+            </w:r>
+          </w:p>
+        </w:tc>
+      </w:tr>
+      <w:tr>
+        <w:tc>
+          <w:tcPr>
+            <w:tcW w:type="dxa" w:w="3402"/>
+          </w:tcPr>
+          <w:p>
+            <w:pPr>
+              <w:spacing w:after="0"/>
+            </w:pPr>
+            <w:r>
+              <w:rPr>
+                <w:sz w:val="16"/>
+              </w:rPr>
+              <w:t>Native platform APIs</w:t>
+            </w:r>
+          </w:p>
+        </w:tc>
+        <w:tc>
+          <w:tcPr>
+            <w:tcW w:type="dxa" w:w="6236"/>
+          </w:tcPr>
+          <w:p>
+            <w:pPr>
+              <w:spacing w:after="0"/>
+            </w:pPr>
+            <w:r>
+              <w:rPr>
+                <w:sz w:val="16"/>
+              </w:rPr>
+              <w:t>Posting to Meta, LinkedIn, YouTube, Pinterest, X</w:t>
+            </w:r>
+          </w:p>
+        </w:tc>
+      </w:tr>
+      <w:tr>
+        <w:tc>
+          <w:tcPr>
+            <w:tcW w:type="dxa" w:w="3402"/>
+          </w:tcPr>
+          <w:p>
+            <w:pPr>
+              <w:spacing w:after="0"/>
+            </w:pPr>
+            <w:r>
+              <w:rPr>
+                <w:sz w:val="16"/>
+              </w:rPr>
+              <w:t>MinIO, Coolify, PostgreSQL</w:t>
+            </w:r>
+          </w:p>
+        </w:tc>
+        <w:tc>
+          <w:tcPr>
+            <w:tcW w:type="dxa" w:w="6236"/>
+          </w:tcPr>
+          <w:p>
+            <w:pPr>
+              <w:spacing w:after="0"/>
+            </w:pPr>
+            <w:r>
+              <w:rPr>
+                <w:sz w:val="16"/>
+              </w:rPr>
+              <w:t>Storage, hosting, database</w:t>
+            </w:r>
+          </w:p>
+        </w:tc>
+      </w:tr>
+    </w:tbl>
+    <w:tbl>
+      <w:tblPr>
+        <w:tblStyle w:val="LightGrid-Accent1"/>
+        <w:tblW w:type="auto" w:w="0"/>
+        <w:tblLook w:firstColumn="1" w:firstRow="1" w:lastColumn="0" w:lastRow="0" w:noHBand="0" w:noVBand="1" w:val="04A0"/>
+      </w:tblPr>
+      <w:tblGrid>
+        <w:gridCol w:w="5270"/>
+        <w:gridCol w:w="5270"/>
+      </w:tblGrid>
+      <w:tr>
+        <w:tc>
+          <w:tcPr>
+            <w:tcW w:type="dxa" w:w="6803"/>
+          </w:tcPr>
+          <w:p>
+            <w:pPr>
+              <w:spacing w:after="0"/>
+            </w:pPr>
+            <w:r>
+              <w:rPr>
+                <w:sz w:val="16"/>
+              </w:rPr>
+            </w:r>
+            <w:r>
+              <w:rPr>
+                <w:b/>
+                <w:sz w:val="16"/>
+              </w:rPr>
+              <w:t>Comparison</w:t>
+            </w:r>
+          </w:p>
+        </w:tc>
+        <w:tc>
+          <w:tcPr>
+            <w:tcW w:type="dxa" w:w="2835"/>
+          </w:tcPr>
+          <w:p>
+            <w:pPr>
+              <w:spacing w:after="0"/>
+            </w:pPr>
+            <w:r>
+              <w:rPr>
+                <w:sz w:val="16"/>
+              </w:rPr>
+            </w:r>
+            <w:r>
+              <w:rPr>
+                <w:b/>
+                <w:sz w:val="16"/>
+              </w:rPr>
+              <w:t>Approx. per month</w:t>
+            </w:r>
+          </w:p>
+        </w:tc>
+      </w:tr>
+      <w:tr>
+        <w:tc>
+          <w:tcPr>
+            <w:tcW w:type="dxa" w:w="6803"/>
+          </w:tcPr>
+          <w:p>
+            <w:pPr>
+              <w:spacing w:after="0"/>
+            </w:pPr>
+            <w:r>
+              <w:rPr>
+                <w:sz w:val="16"/>
+              </w:rPr>
+              <w:t>Tools Firefly Services could replace (Placid + OpenAI images)</w:t>
+            </w:r>
+          </w:p>
+        </w:tc>
+        <w:tc>
+          <w:tcPr>
+            <w:tcW w:type="dxa" w:w="2835"/>
+          </w:tcPr>
+          <w:p>
+            <w:pPr>
+              <w:spacing w:after="0"/>
+            </w:pPr>
+            <w:r>
+              <w:rPr>
+                <w:sz w:val="16"/>
+              </w:rPr>
+              <w:t>$40-90</w:t>
+            </w:r>
+          </w:p>
+        </w:tc>
+      </w:tr>
+      <w:tr>
+        <w:tc>
+          <w:tcPr>
+            <w:tcW w:type="dxa" w:w="6803"/>
+          </w:tcPr>
+          <w:p>
+            <w:pPr>
+              <w:spacing w:after="0"/>
+            </w:pPr>
+            <w:r>
+              <w:rPr>
+                <w:sz w:val="16"/>
+              </w:rPr>
+              <w:t>Firefly Services (enterprise, estimate)</w:t>
+            </w:r>
+          </w:p>
+        </w:tc>
+        <w:tc>
+          <w:tcPr>
+            <w:tcW w:type="dxa" w:w="2835"/>
+          </w:tcPr>
+          <w:p>
+            <w:pPr>
+              <w:spacing w:after="0"/>
+            </w:pPr>
+            <w:r>
+              <w:rPr>
+                <w:sz w:val="16"/>
+              </w:rPr>
+              <w:t>about $1,000+ (quote only)</w:t>
+            </w:r>
+          </w:p>
+        </w:tc>
+      </w:tr>
+      <w:tr>
+        <w:tc>
+          <w:tcPr>
+            <w:tcW w:type="dxa" w:w="6803"/>
+          </w:tcPr>
+          <w:p>
+            <w:pPr>
+              <w:spacing w:after="0"/>
+            </w:pPr>
+            <w:r>
+              <w:rPr>
+                <w:sz w:val="16"/>
+              </w:rPr>
+              <w:t>Plan total WITHOUT Firefly Services</w:t>
+            </w:r>
+          </w:p>
+        </w:tc>
+        <w:tc>
+          <w:tcPr>
+            <w:tcW w:type="dxa" w:w="2835"/>
+          </w:tcPr>
+          <w:p>
+            <w:pPr>
+              <w:spacing w:after="0"/>
+            </w:pPr>
+            <w:r>
+              <w:rPr>
+                <w:sz w:val="16"/>
+              </w:rPr>
+              <w:t>about $250-680</w:t>
+            </w:r>
+          </w:p>
+        </w:tc>
+      </w:tr>
+      <w:tr>
+        <w:tc>
+          <w:tcPr>
+            <w:tcW w:type="dxa" w:w="6803"/>
+          </w:tcPr>
+          <w:p>
+            <w:pPr>
+              <w:spacing w:after="0"/>
+            </w:pPr>
+            <w:r>
+              <w:rPr>
+                <w:sz w:val="16"/>
+              </w:rPr>
+              <w:t>Plan total WITH Firefly Services (minus replaced tools)</w:t>
+            </w:r>
+          </w:p>
+        </w:tc>
+        <w:tc>
+          <w:tcPr>
+            <w:tcW w:type="dxa" w:w="2835"/>
+          </w:tcPr>
+          <w:p>
+            <w:pPr>
+              <w:spacing w:after="0"/>
+            </w:pPr>
+            <w:r>
+              <w:rPr>
+                <w:sz w:val="16"/>
+              </w:rPr>
+              <w:t>about $1,160-1,640+</w:t>
+            </w:r>
+          </w:p>
+        </w:tc>
+      </w:tr>
+    </w:tbl>
+    <w:p>
+      <w:r>
+        <w:t>Recommendation: not now. Firefly Services costs much more than the tools it replaces at our volume. Ask Adobe sales for a small-volume quote (Photoshop + Firefly APIs only); if it is under about $150 per month, switch Placid and OpenAI images to Firefly.</w:t>
+      </w:r>
+    </w:p>
     <w:sectPr>
       <w:pgSz w:w="12240" w:h="15840"/>
       <w:pgMar w:top="680" w:right="850" w:bottom="680" w:left="850" w:header="720" w:footer="720" w:gutter="0"/>

</xml_diff>

<commit_message>
Tools checklist: move Firefly Services into design tools, drop replaced tools
Co-Authored-By: Claude Opus 5.5 <noreply@anthropic.com>
Claude-Session: https://claude.ai/code/session_01L79zFsj3j3wYAWjFgWLRux
</commit_message>
<xml_diff>
--- a/docs/SMM_Tools_Checklist.docx
+++ b/docs/SMM_Tools_Checklist.docx
@@ -422,7 +422,7 @@
               <w:rPr>
                 <w:sz w:val="16"/>
               </w:rPr>
-              <w:t>Concept images, edits by prompt, second fact check</w:t>
+              <w:t>Second fact check of captions and replies (text only)</w:t>
             </w:r>
           </w:p>
         </w:tc>
@@ -454,7 +454,7 @@
               <w:rPr>
                 <w:sz w:val="16"/>
               </w:rPr>
-              <w:t>$20-50 (usage)</w:t>
+              <w:t>$10-20 (usage)</w:t>
             </w:r>
           </w:p>
         </w:tc>
@@ -666,7 +666,7 @@
               <w:rPr>
                 <w:sz w:val="16"/>
               </w:rPr>
-              <w:t>Placid</w:t>
+              <w:t>Adobe Firefly Services: Firefly API</w:t>
             </w:r>
           </w:p>
         </w:tc>
@@ -682,7 +682,7 @@
               <w:rPr>
                 <w:sz w:val="16"/>
               </w:rPr>
-              <w:t>Branded images, carousels, story templates</w:t>
+              <w:t>Concept images, backgrounds, generative fill and expand, edit by prompt (commercially safe)</w:t>
             </w:r>
           </w:p>
         </w:tc>
@@ -714,7 +714,7 @@
               <w:rPr>
                 <w:sz w:val="16"/>
               </w:rPr>
-              <w:t>$19-39</w:t>
+              <w:t>Included in Firefly Services (enterprise; quote from Adobe, est. about $1,000+)</w:t>
             </w:r>
           </w:p>
         </w:tc>
@@ -730,7 +730,7 @@
               <w:rPr>
                 <w:sz w:val="16"/>
               </w:rPr>
-              <w:t>placid.app/pricing</w:t>
+              <w:t>developer.adobe.com/firefly-services</w:t>
             </w:r>
           </w:p>
         </w:tc>
@@ -748,7 +748,7 @@
               <w:rPr>
                 <w:sz w:val="16"/>
               </w:rPr>
-              <w:t>5</w:t>
+              <w:t>4a</w:t>
             </w:r>
           </w:p>
         </w:tc>
@@ -764,7 +764,7 @@
               <w:rPr>
                 <w:sz w:val="16"/>
               </w:rPr>
-              <w:t>Creatomate</w:t>
+              <w:t>Firefly Services: Photoshop API</w:t>
             </w:r>
           </w:p>
         </w:tc>
@@ -780,7 +780,7 @@
               <w:rPr>
                 <w:sz w:val="16"/>
               </w:rPr>
-              <w:t>Quick Reels, Shorts, subtitles, motion templates</w:t>
+              <w:t>Fill brand PSD templates, remove backgrounds, resize for every platform, single posts and stories</w:t>
             </w:r>
           </w:p>
         </w:tc>
@@ -812,7 +812,7 @@
               <w:rPr>
                 <w:sz w:val="16"/>
               </w:rPr>
-              <w:t>$41-129</w:t>
+              <w:t>Included</w:t>
             </w:r>
           </w:p>
         </w:tc>
@@ -828,7 +828,7 @@
               <w:rPr>
                 <w:sz w:val="16"/>
               </w:rPr>
-              <w:t>creatomate.com/pricing</w:t>
+              <w:t>developer.adobe.com/firefly-services</w:t>
             </w:r>
           </w:p>
         </w:tc>
@@ -846,7 +846,7 @@
               <w:rPr>
                 <w:sz w:val="16"/>
               </w:rPr>
-              <w:t>6</w:t>
+              <w:t>4b</w:t>
             </w:r>
           </w:p>
         </w:tc>
@@ -862,7 +862,7 @@
               <w:rPr>
                 <w:sz w:val="16"/>
               </w:rPr>
-              <w:t>Plainly</w:t>
+              <w:t>Firefly Services: InDesign API</w:t>
             </w:r>
           </w:p>
         </w:tc>
@@ -878,7 +878,7 @@
               <w:rPr>
                 <w:sz w:val="16"/>
               </w:rPr>
-              <w:t>After Effects quality videos by API</w:t>
+              <w:t>Carousels, multi-page layouts, PDF guides from templates</w:t>
             </w:r>
           </w:p>
         </w:tc>
@@ -910,7 +910,7 @@
               <w:rPr>
                 <w:sz w:val="16"/>
               </w:rPr>
-              <w:t>From about $69</w:t>
+              <w:t>Included</w:t>
             </w:r>
           </w:p>
         </w:tc>
@@ -926,7 +926,7 @@
               <w:rPr>
                 <w:sz w:val="16"/>
               </w:rPr>
-              <w:t>plainlyvideos.com/pricing</w:t>
+              <w:t>developer.adobe.com/firefly-services</w:t>
             </w:r>
           </w:p>
         </w:tc>
@@ -944,7 +944,7 @@
               <w:rPr>
                 <w:sz w:val="16"/>
               </w:rPr>
-              <w:t>7</w:t>
+              <w:t>4c</w:t>
             </w:r>
           </w:p>
         </w:tc>
@@ -960,7 +960,7 @@
               <w:rPr>
                 <w:sz w:val="16"/>
               </w:rPr>
-              <w:t>Adobe After Effects</w:t>
+              <w:t>Firefly Services: Lightroom API</w:t>
             </w:r>
           </w:p>
         </w:tc>
@@ -976,7 +976,7 @@
               <w:rPr>
                 <w:sz w:val="16"/>
               </w:rPr>
-              <w:t>Designer builds motion templates</w:t>
+              <w:t>Auto colour and light correction for uploaded event photos</w:t>
             </w:r>
           </w:p>
         </w:tc>
@@ -992,7 +992,7 @@
               <w:rPr>
                 <w:sz w:val="16"/>
               </w:rPr>
-              <w:t>New if not owned</w:t>
+              <w:t>New</w:t>
             </w:r>
           </w:p>
         </w:tc>
@@ -1008,7 +1008,7 @@
               <w:rPr>
                 <w:sz w:val="16"/>
               </w:rPr>
-              <w:t>about $23</w:t>
+              <w:t>Included</w:t>
             </w:r>
           </w:p>
         </w:tc>
@@ -1024,7 +1024,7 @@
               <w:rPr>
                 <w:sz w:val="16"/>
               </w:rPr>
-              <w:t>adobe.com/products/aftereffects.html</w:t>
+              <w:t>developer.adobe.com/firefly-services</w:t>
             </w:r>
           </w:p>
         </w:tc>
@@ -1042,7 +1042,7 @@
               <w:rPr>
                 <w:sz w:val="16"/>
               </w:rPr>
-              <w:t>8</w:t>
+              <w:t>4d</w:t>
             </w:r>
           </w:p>
         </w:tc>
@@ -1058,7 +1058,7 @@
               <w:rPr>
                 <w:sz w:val="16"/>
               </w:rPr>
-              <w:t>Epidemic Sound</w:t>
+              <w:t>Firefly Services: Content Tagging API</w:t>
             </w:r>
           </w:p>
         </w:tc>
@@ -1074,7 +1074,7 @@
               <w:rPr>
                 <w:sz w:val="16"/>
               </w:rPr>
-              <w:t>Licensed music and sound effects</w:t>
+              <w:t>Auto-tags every file in the Asset Library</w:t>
             </w:r>
           </w:p>
         </w:tc>
@@ -1106,7 +1106,7 @@
               <w:rPr>
                 <w:sz w:val="16"/>
               </w:rPr>
-              <w:t>$49-75 (or $0 with YouTube Audio Library)</w:t>
+              <w:t>Included</w:t>
             </w:r>
           </w:p>
         </w:tc>
@@ -1122,7 +1122,7 @@
               <w:rPr>
                 <w:sz w:val="16"/>
               </w:rPr>
-              <w:t>epidemicsound.com/pricing</w:t>
+              <w:t>developer.adobe.com/firefly-services</w:t>
             </w:r>
           </w:p>
         </w:tc>
@@ -1140,7 +1140,7 @@
               <w:rPr>
                 <w:sz w:val="16"/>
               </w:rPr>
-              <w:t>9</w:t>
+              <w:t>4e</w:t>
             </w:r>
           </w:p>
         </w:tc>
@@ -1156,7 +1156,7 @@
               <w:rPr>
                 <w:sz w:val="16"/>
               </w:rPr>
-              <w:t>Unsplash API</w:t>
+              <w:t>Firefly Services: Audio / Video APIs</w:t>
             </w:r>
           </w:p>
         </w:tc>
@@ -1172,7 +1172,7 @@
               <w:rPr>
                 <w:sz w:val="16"/>
               </w:rPr>
-              <w:t>Licensed stock photos</w:t>
+              <w:t>Dubbing, translation, AI video clips and B-roll</w:t>
             </w:r>
           </w:p>
         </w:tc>
@@ -1204,7 +1204,7 @@
               <w:rPr>
                 <w:sz w:val="16"/>
               </w:rPr>
-              <w:t>Free</w:t>
+              <w:t>Included</w:t>
             </w:r>
           </w:p>
         </w:tc>
@@ -1220,7 +1220,7 @@
               <w:rPr>
                 <w:sz w:val="16"/>
               </w:rPr>
-              <w:t>unsplash.com/developers</w:t>
+              <w:t>developer.adobe.com/firefly-services</w:t>
             </w:r>
           </w:p>
         </w:tc>
@@ -1238,7 +1238,7 @@
               <w:rPr>
                 <w:sz w:val="16"/>
               </w:rPr>
-              <w:t>10</w:t>
+              <w:t>5</w:t>
             </w:r>
           </w:p>
         </w:tc>
@@ -1254,7 +1254,7 @@
               <w:rPr>
                 <w:sz w:val="16"/>
               </w:rPr>
-              <w:t>Canva (current plan)</w:t>
+              <w:t>Creatomate</w:t>
             </w:r>
           </w:p>
         </w:tc>
@@ -1270,7 +1270,7 @@
               <w:rPr>
                 <w:sz w:val="16"/>
               </w:rPr>
-              <w:t>Manual edits by the team</w:t>
+              <w:t>Quick Reels, Shorts, subtitles, motion templates</w:t>
             </w:r>
           </w:p>
         </w:tc>
@@ -1286,7 +1286,7 @@
               <w:rPr>
                 <w:sz w:val="16"/>
               </w:rPr>
-              <w:t>Existing</w:t>
+              <w:t>New</w:t>
             </w:r>
           </w:p>
         </w:tc>
@@ -1302,7 +1302,7 @@
               <w:rPr>
                 <w:sz w:val="16"/>
               </w:rPr>
-              <w:t>$0 extra</w:t>
+              <w:t>$41-129</w:t>
             </w:r>
           </w:p>
         </w:tc>
@@ -1318,7 +1318,7 @@
               <w:rPr>
                 <w:sz w:val="16"/>
               </w:rPr>
-              <w:t>canva.com/pricing</w:t>
+              <w:t>creatomate.com/pricing</w:t>
             </w:r>
           </w:p>
         </w:tc>
@@ -1336,7 +1336,7 @@
               <w:rPr>
                 <w:sz w:val="16"/>
               </w:rPr>
-              <w:t>11</w:t>
+              <w:t>6</w:t>
             </w:r>
           </w:p>
         </w:tc>
@@ -1352,7 +1352,7 @@
               <w:rPr>
                 <w:sz w:val="16"/>
               </w:rPr>
-              <w:t>Descript or CapCut (optional)</w:t>
+              <w:t>Plainly</w:t>
             </w:r>
           </w:p>
         </w:tc>
@@ -1368,7 +1368,7 @@
               <w:rPr>
                 <w:sz w:val="16"/>
               </w:rPr>
-              <w:t>Manual video touch-ups</w:t>
+              <w:t>After Effects quality videos by API</w:t>
             </w:r>
           </w:p>
         </w:tc>
@@ -1384,7 +1384,7 @@
               <w:rPr>
                 <w:sz w:val="16"/>
               </w:rPr>
-              <w:t>Optional</w:t>
+              <w:t>New</w:t>
             </w:r>
           </w:p>
         </w:tc>
@@ -1400,7 +1400,7 @@
               <w:rPr>
                 <w:sz w:val="16"/>
               </w:rPr>
-              <w:t>$8-24</w:t>
+              <w:t>From about $69</w:t>
             </w:r>
           </w:p>
         </w:tc>
@@ -1416,7 +1416,301 @@
               <w:rPr>
                 <w:sz w:val="16"/>
               </w:rPr>
-              <w:t>descript.com/pricing</w:t>
+              <w:t>plainlyvideos.com/pricing</w:t>
+            </w:r>
+          </w:p>
+        </w:tc>
+      </w:tr>
+      <w:tr>
+        <w:tc>
+          <w:tcPr>
+            <w:tcW w:type="dxa" w:w="340"/>
+          </w:tcPr>
+          <w:p>
+            <w:pPr>
+              <w:spacing w:after="0"/>
+            </w:pPr>
+            <w:r>
+              <w:rPr>
+                <w:sz w:val="16"/>
+              </w:rPr>
+              <w:t>7</w:t>
+            </w:r>
+          </w:p>
+        </w:tc>
+        <w:tc>
+          <w:tcPr>
+            <w:tcW w:type="dxa" w:w="1701"/>
+          </w:tcPr>
+          <w:p>
+            <w:pPr>
+              <w:spacing w:after="0"/>
+            </w:pPr>
+            <w:r>
+              <w:rPr>
+                <w:sz w:val="16"/>
+              </w:rPr>
+              <w:t>Adobe After Effects</w:t>
+            </w:r>
+          </w:p>
+        </w:tc>
+        <w:tc>
+          <w:tcPr>
+            <w:tcW w:type="dxa" w:w="2835"/>
+          </w:tcPr>
+          <w:p>
+            <w:pPr>
+              <w:spacing w:after="0"/>
+            </w:pPr>
+            <w:r>
+              <w:rPr>
+                <w:sz w:val="16"/>
+              </w:rPr>
+              <w:t>Designer builds motion templates</w:t>
+            </w:r>
+          </w:p>
+        </w:tc>
+        <w:tc>
+          <w:tcPr>
+            <w:tcW w:type="dxa" w:w="907"/>
+          </w:tcPr>
+          <w:p>
+            <w:pPr>
+              <w:spacing w:after="0"/>
+            </w:pPr>
+            <w:r>
+              <w:rPr>
+                <w:sz w:val="16"/>
+              </w:rPr>
+              <w:t>New if not owned</w:t>
+            </w:r>
+          </w:p>
+        </w:tc>
+        <w:tc>
+          <w:tcPr>
+            <w:tcW w:type="dxa" w:w="1531"/>
+          </w:tcPr>
+          <w:p>
+            <w:pPr>
+              <w:spacing w:after="0"/>
+            </w:pPr>
+            <w:r>
+              <w:rPr>
+                <w:sz w:val="16"/>
+              </w:rPr>
+              <w:t>about $23</w:t>
+            </w:r>
+          </w:p>
+        </w:tc>
+        <w:tc>
+          <w:tcPr>
+            <w:tcW w:type="dxa" w:w="2324"/>
+          </w:tcPr>
+          <w:p>
+            <w:pPr>
+              <w:spacing w:after="0"/>
+            </w:pPr>
+            <w:r>
+              <w:rPr>
+                <w:sz w:val="16"/>
+              </w:rPr>
+              <w:t>adobe.com/products/aftereffects.html</w:t>
+            </w:r>
+          </w:p>
+        </w:tc>
+      </w:tr>
+      <w:tr>
+        <w:tc>
+          <w:tcPr>
+            <w:tcW w:type="dxa" w:w="340"/>
+          </w:tcPr>
+          <w:p>
+            <w:pPr>
+              <w:spacing w:after="0"/>
+            </w:pPr>
+            <w:r>
+              <w:rPr>
+                <w:sz w:val="16"/>
+              </w:rPr>
+              <w:t>8</w:t>
+            </w:r>
+          </w:p>
+        </w:tc>
+        <w:tc>
+          <w:tcPr>
+            <w:tcW w:type="dxa" w:w="1701"/>
+          </w:tcPr>
+          <w:p>
+            <w:pPr>
+              <w:spacing w:after="0"/>
+            </w:pPr>
+            <w:r>
+              <w:rPr>
+                <w:sz w:val="16"/>
+              </w:rPr>
+              <w:t>Epidemic Sound</w:t>
+            </w:r>
+          </w:p>
+        </w:tc>
+        <w:tc>
+          <w:tcPr>
+            <w:tcW w:type="dxa" w:w="2835"/>
+          </w:tcPr>
+          <w:p>
+            <w:pPr>
+              <w:spacing w:after="0"/>
+            </w:pPr>
+            <w:r>
+              <w:rPr>
+                <w:sz w:val="16"/>
+              </w:rPr>
+              <w:t>Licensed music and sound effects</w:t>
+            </w:r>
+          </w:p>
+        </w:tc>
+        <w:tc>
+          <w:tcPr>
+            <w:tcW w:type="dxa" w:w="907"/>
+          </w:tcPr>
+          <w:p>
+            <w:pPr>
+              <w:spacing w:after="0"/>
+            </w:pPr>
+            <w:r>
+              <w:rPr>
+                <w:sz w:val="16"/>
+              </w:rPr>
+              <w:t>New</w:t>
+            </w:r>
+          </w:p>
+        </w:tc>
+        <w:tc>
+          <w:tcPr>
+            <w:tcW w:type="dxa" w:w="1531"/>
+          </w:tcPr>
+          <w:p>
+            <w:pPr>
+              <w:spacing w:after="0"/>
+            </w:pPr>
+            <w:r>
+              <w:rPr>
+                <w:sz w:val="16"/>
+              </w:rPr>
+              <w:t>$49-75 (or $0 with YouTube Audio Library)</w:t>
+            </w:r>
+          </w:p>
+        </w:tc>
+        <w:tc>
+          <w:tcPr>
+            <w:tcW w:type="dxa" w:w="2324"/>
+          </w:tcPr>
+          <w:p>
+            <w:pPr>
+              <w:spacing w:after="0"/>
+            </w:pPr>
+            <w:r>
+              <w:rPr>
+                <w:sz w:val="16"/>
+              </w:rPr>
+              <w:t>epidemicsound.com/pricing</w:t>
+            </w:r>
+          </w:p>
+        </w:tc>
+      </w:tr>
+      <w:tr>
+        <w:tc>
+          <w:tcPr>
+            <w:tcW w:type="dxa" w:w="340"/>
+          </w:tcPr>
+          <w:p>
+            <w:pPr>
+              <w:spacing w:after="0"/>
+            </w:pPr>
+            <w:r>
+              <w:rPr>
+                <w:sz w:val="16"/>
+              </w:rPr>
+              <w:t>10</w:t>
+            </w:r>
+          </w:p>
+        </w:tc>
+        <w:tc>
+          <w:tcPr>
+            <w:tcW w:type="dxa" w:w="1701"/>
+          </w:tcPr>
+          <w:p>
+            <w:pPr>
+              <w:spacing w:after="0"/>
+            </w:pPr>
+            <w:r>
+              <w:rPr>
+                <w:sz w:val="16"/>
+              </w:rPr>
+              <w:t>Canva (current plan)</w:t>
+            </w:r>
+          </w:p>
+        </w:tc>
+        <w:tc>
+          <w:tcPr>
+            <w:tcW w:type="dxa" w:w="2835"/>
+          </w:tcPr>
+          <w:p>
+            <w:pPr>
+              <w:spacing w:after="0"/>
+            </w:pPr>
+            <w:r>
+              <w:rPr>
+                <w:sz w:val="16"/>
+              </w:rPr>
+              <w:t>Manual edits by the team</w:t>
+            </w:r>
+          </w:p>
+        </w:tc>
+        <w:tc>
+          <w:tcPr>
+            <w:tcW w:type="dxa" w:w="907"/>
+          </w:tcPr>
+          <w:p>
+            <w:pPr>
+              <w:spacing w:after="0"/>
+            </w:pPr>
+            <w:r>
+              <w:rPr>
+                <w:sz w:val="16"/>
+              </w:rPr>
+              <w:t>Existing</w:t>
+            </w:r>
+          </w:p>
+        </w:tc>
+        <w:tc>
+          <w:tcPr>
+            <w:tcW w:type="dxa" w:w="1531"/>
+          </w:tcPr>
+          <w:p>
+            <w:pPr>
+              <w:spacing w:after="0"/>
+            </w:pPr>
+            <w:r>
+              <w:rPr>
+                <w:sz w:val="16"/>
+              </w:rPr>
+              <w:t>$0 extra</w:t>
+            </w:r>
+          </w:p>
+        </w:tc>
+        <w:tc>
+          <w:tcPr>
+            <w:tcW w:type="dxa" w:w="2324"/>
+          </w:tcPr>
+          <w:p>
+            <w:pPr>
+              <w:spacing w:after="0"/>
+            </w:pPr>
+            <w:r>
+              <w:rPr>
+                <w:sz w:val="16"/>
+              </w:rPr>
+              <w:t>canva.com/pricing</w:t>
             </w:r>
           </w:p>
         </w:tc>
@@ -4789,7 +5083,7 @@
               <w:rPr>
                 <w:sz w:val="16"/>
               </w:rPr>
-              <w:t>Adobe Photoshop API (Firefly Services)</w:t>
+              <w:t>nexrender</w:t>
             </w:r>
           </w:p>
         </w:tc>
@@ -4805,7 +5099,7 @@
               <w:rPr>
                 <w:sz w:val="16"/>
               </w:rPr>
-              <w:t>Enterprise contract only (ETLA); high cost</w:t>
+              <w:t>Needs our own render machine with After Effects</w:t>
             </w:r>
           </w:p>
         </w:tc>
@@ -4821,7 +5115,7 @@
               <w:rPr>
                 <w:sz w:val="16"/>
               </w:rPr>
-              <w:t>Placid + OpenAI</w:t>
+              <w:t>Plainly</w:t>
             </w:r>
           </w:p>
         </w:tc>
@@ -4837,7 +5131,7 @@
               <w:rPr>
                 <w:sz w:val="16"/>
               </w:rPr>
-              <w:t>developer.adobe.com/firefly-services</w:t>
+              <w:t>github.com/inlife/nexrender</w:t>
             </w:r>
           </w:p>
         </w:tc>
@@ -4855,7 +5149,7 @@
               <w:rPr>
                 <w:sz w:val="16"/>
               </w:rPr>
-              <w:t>nexrender</w:t>
+              <w:t>Shotstack</w:t>
             </w:r>
           </w:p>
         </w:tc>
@@ -4871,7 +5165,7 @@
               <w:rPr>
                 <w:sz w:val="16"/>
               </w:rPr>
-              <w:t>Needs our own render machine with After Effects</w:t>
+              <w:t>Backup only; Creatomate covers it</w:t>
             </w:r>
           </w:p>
         </w:tc>
@@ -4887,7 +5181,7 @@
               <w:rPr>
                 <w:sz w:val="16"/>
               </w:rPr>
-              <w:t>Plainly</w:t>
+              <w:t>Creatomate</w:t>
             </w:r>
           </w:p>
         </w:tc>
@@ -4903,7 +5197,7 @@
               <w:rPr>
                 <w:sz w:val="16"/>
               </w:rPr>
-              <w:t>github.com/inlife/nexrender</w:t>
+              <w:t>shotstack.io/pricing</w:t>
             </w:r>
           </w:p>
         </w:tc>
@@ -4921,7 +5215,7 @@
               <w:rPr>
                 <w:sz w:val="16"/>
               </w:rPr>
-              <w:t>Shotstack</w:t>
+              <w:t>Remotion</w:t>
             </w:r>
           </w:p>
         </w:tc>
@@ -4937,7 +5231,7 @@
               <w:rPr>
                 <w:sz w:val="16"/>
               </w:rPr>
-              <w:t>Backup only; Creatomate covers it</w:t>
+              <w:t>Code-heavy; later option only</w:t>
             </w:r>
           </w:p>
         </w:tc>
@@ -4953,7 +5247,7 @@
               <w:rPr>
                 <w:sz w:val="16"/>
               </w:rPr>
-              <w:t>Creatomate</w:t>
+              <w:t>Creatomate / Plainly</w:t>
             </w:r>
           </w:p>
         </w:tc>
@@ -4969,7 +5263,7 @@
               <w:rPr>
                 <w:sz w:val="16"/>
               </w:rPr>
-              <w:t>shotstack.io/pricing</w:t>
+              <w:t>remotion.dev/pricing</w:t>
             </w:r>
           </w:p>
         </w:tc>
@@ -4987,7 +5281,7 @@
               <w:rPr>
                 <w:sz w:val="16"/>
               </w:rPr>
-              <w:t>Remotion</w:t>
+              <w:t>Placid</w:t>
             </w:r>
           </w:p>
         </w:tc>
@@ -5003,7 +5297,7 @@
               <w:rPr>
                 <w:sz w:val="16"/>
               </w:rPr>
-              <w:t>Code-heavy; later option only</w:t>
+              <w:t>Replaced by Firefly Services (Photoshop + InDesign APIs)</w:t>
             </w:r>
           </w:p>
         </w:tc>
@@ -5019,7 +5313,7 @@
               <w:rPr>
                 <w:sz w:val="16"/>
               </w:rPr>
-              <w:t>Creatomate / Plainly</w:t>
+              <w:t>Firefly Services</w:t>
             </w:r>
           </w:p>
         </w:tc>
@@ -5035,7 +5329,205 @@
               <w:rPr>
                 <w:sz w:val="16"/>
               </w:rPr>
-              <w:t>remotion.dev/pricing</w:t>
+              <w:t>placid.app</w:t>
+            </w:r>
+          </w:p>
+        </w:tc>
+      </w:tr>
+      <w:tr>
+        <w:tc>
+          <w:tcPr>
+            <w:tcW w:type="dxa" w:w="2268"/>
+          </w:tcPr>
+          <w:p>
+            <w:pPr>
+              <w:spacing w:after="0"/>
+            </w:pPr>
+            <w:r>
+              <w:rPr>
+                <w:sz w:val="16"/>
+              </w:rPr>
+              <w:t>OpenAI images</w:t>
+            </w:r>
+          </w:p>
+        </w:tc>
+        <w:tc>
+          <w:tcPr>
+            <w:tcW w:type="dxa" w:w="3118"/>
+          </w:tcPr>
+          <w:p>
+            <w:pPr>
+              <w:spacing w:after="0"/>
+            </w:pPr>
+            <w:r>
+              <w:rPr>
+                <w:sz w:val="16"/>
+              </w:rPr>
+              <w:t>Replaced by Firefly API (OpenAI kept only for text fact check)</w:t>
+            </w:r>
+          </w:p>
+        </w:tc>
+        <w:tc>
+          <w:tcPr>
+            <w:tcW w:type="dxa" w:w="1984"/>
+          </w:tcPr>
+          <w:p>
+            <w:pPr>
+              <w:spacing w:after="0"/>
+            </w:pPr>
+            <w:r>
+              <w:rPr>
+                <w:sz w:val="16"/>
+              </w:rPr>
+              <w:t>Firefly Services</w:t>
+            </w:r>
+          </w:p>
+        </w:tc>
+        <w:tc>
+          <w:tcPr>
+            <w:tcW w:type="dxa" w:w="2268"/>
+          </w:tcPr>
+          <w:p>
+            <w:pPr>
+              <w:spacing w:after="0"/>
+            </w:pPr>
+            <w:r>
+              <w:rPr>
+                <w:sz w:val="16"/>
+              </w:rPr>
+              <w:t>-</w:t>
+            </w:r>
+          </w:p>
+        </w:tc>
+      </w:tr>
+      <w:tr>
+        <w:tc>
+          <w:tcPr>
+            <w:tcW w:type="dxa" w:w="2268"/>
+          </w:tcPr>
+          <w:p>
+            <w:pPr>
+              <w:spacing w:after="0"/>
+            </w:pPr>
+            <w:r>
+              <w:rPr>
+                <w:sz w:val="16"/>
+              </w:rPr>
+              <w:t>Unsplash</w:t>
+            </w:r>
+          </w:p>
+        </w:tc>
+        <w:tc>
+          <w:tcPr>
+            <w:tcW w:type="dxa" w:w="3118"/>
+          </w:tcPr>
+          <w:p>
+            <w:pPr>
+              <w:spacing w:after="0"/>
+            </w:pPr>
+            <w:r>
+              <w:rPr>
+                <w:sz w:val="16"/>
+              </w:rPr>
+              <w:t>Replaced by Firefly image generation and our own photos</w:t>
+            </w:r>
+          </w:p>
+        </w:tc>
+        <w:tc>
+          <w:tcPr>
+            <w:tcW w:type="dxa" w:w="1984"/>
+          </w:tcPr>
+          <w:p>
+            <w:pPr>
+              <w:spacing w:after="0"/>
+            </w:pPr>
+            <w:r>
+              <w:rPr>
+                <w:sz w:val="16"/>
+              </w:rPr>
+              <w:t>Firefly Services</w:t>
+            </w:r>
+          </w:p>
+        </w:tc>
+        <w:tc>
+          <w:tcPr>
+            <w:tcW w:type="dxa" w:w="2268"/>
+          </w:tcPr>
+          <w:p>
+            <w:pPr>
+              <w:spacing w:after="0"/>
+            </w:pPr>
+            <w:r>
+              <w:rPr>
+                <w:sz w:val="16"/>
+              </w:rPr>
+              <w:t>unsplash.com</w:t>
+            </w:r>
+          </w:p>
+        </w:tc>
+      </w:tr>
+      <w:tr>
+        <w:tc>
+          <w:tcPr>
+            <w:tcW w:type="dxa" w:w="2268"/>
+          </w:tcPr>
+          <w:p>
+            <w:pPr>
+              <w:spacing w:after="0"/>
+            </w:pPr>
+            <w:r>
+              <w:rPr>
+                <w:sz w:val="16"/>
+              </w:rPr>
+              <w:t>Descript / CapCut</w:t>
+            </w:r>
+          </w:p>
+        </w:tc>
+        <w:tc>
+          <w:tcPr>
+            <w:tcW w:type="dxa" w:w="3118"/>
+          </w:tcPr>
+          <w:p>
+            <w:pPr>
+              <w:spacing w:after="0"/>
+            </w:pPr>
+            <w:r>
+              <w:rPr>
+                <w:sz w:val="16"/>
+              </w:rPr>
+              <w:t>Replaced by Firefly Audio/Video APIs + Creatomate</w:t>
+            </w:r>
+          </w:p>
+        </w:tc>
+        <w:tc>
+          <w:tcPr>
+            <w:tcW w:type="dxa" w:w="1984"/>
+          </w:tcPr>
+          <w:p>
+            <w:pPr>
+              <w:spacing w:after="0"/>
+            </w:pPr>
+            <w:r>
+              <w:rPr>
+                <w:sz w:val="16"/>
+              </w:rPr>
+              <w:t>Firefly Services</w:t>
+            </w:r>
+          </w:p>
+        </w:tc>
+        <w:tc>
+          <w:tcPr>
+            <w:tcW w:type="dxa" w:w="2268"/>
+          </w:tcPr>
+          <w:p>
+            <w:pPr>
+              <w:spacing w:after="0"/>
+            </w:pPr>
+            <w:r>
+              <w:rPr>
+                <w:sz w:val="16"/>
+              </w:rPr>
+              <w:t>-</w:t>
             </w:r>
           </w:p>
         </w:tc>
@@ -5266,7 +5758,7 @@
       <w:tr>
         <w:tc>
           <w:tcPr>
-            <w:tcW w:type="dxa" w:w="1701"/>
+            <w:tcW w:type="dxa" w:w="1814"/>
           </w:tcPr>
           <w:p>
             <w:pPr>
@@ -5288,7 +5780,7 @@
         </w:tc>
         <w:tc>
           <w:tcPr>
-            <w:tcW w:type="dxa" w:w="5953"/>
+            <w:tcW w:type="dxa" w:w="5839"/>
           </w:tcPr>
           <w:p>
             <w:pPr>
@@ -5334,7 +5826,7 @@
       <w:tr>
         <w:tc>
           <w:tcPr>
-            <w:tcW w:type="dxa" w:w="1701"/>
+            <w:tcW w:type="dxa" w:w="1814"/>
           </w:tcPr>
           <w:p>
             <w:pPr>
@@ -5350,17 +5842,17 @@
         </w:tc>
         <w:tc>
           <w:tcPr>
-            <w:tcW w:type="dxa" w:w="5953"/>
-          </w:tcPr>
-          <w:p>
-            <w:pPr>
-              <w:spacing w:after="0"/>
-            </w:pPr>
-            <w:r>
-              <w:rPr>
-                <w:sz w:val="16"/>
-              </w:rPr>
-              <w:t>Claude extra usage $40-100, Grok $30-80, OpenAI $20-50</w:t>
+            <w:tcW w:type="dxa" w:w="5839"/>
+          </w:tcPr>
+          <w:p>
+            <w:pPr>
+              <w:spacing w:after="0"/>
+            </w:pPr>
+            <w:r>
+              <w:rPr>
+                <w:sz w:val="16"/>
+              </w:rPr>
+              <w:t>Claude extra usage $40-100, Grok $30-80, OpenAI text checks $10-20</w:t>
             </w:r>
           </w:p>
         </w:tc>
@@ -5376,7 +5868,7 @@
               <w:rPr>
                 <w:sz w:val="16"/>
               </w:rPr>
-              <w:t>$90-230</w:t>
+              <w:t>$80-200</w:t>
             </w:r>
           </w:p>
         </w:tc>
@@ -5384,33 +5876,33 @@
       <w:tr>
         <w:tc>
           <w:tcPr>
-            <w:tcW w:type="dxa" w:w="1701"/>
-          </w:tcPr>
-          <w:p>
-            <w:pPr>
-              <w:spacing w:after="0"/>
-            </w:pPr>
-            <w:r>
-              <w:rPr>
-                <w:sz w:val="16"/>
-              </w:rPr>
-              <w:t>Design and video</w:t>
-            </w:r>
-          </w:p>
-        </w:tc>
-        <w:tc>
-          <w:tcPr>
-            <w:tcW w:type="dxa" w:w="5953"/>
-          </w:tcPr>
-          <w:p>
-            <w:pPr>
-              <w:spacing w:after="0"/>
-            </w:pPr>
-            <w:r>
-              <w:rPr>
-                <w:sz w:val="16"/>
-              </w:rPr>
-              <w:t>Placid $19-39, Creatomate $41-129, Plainly $69-150, After Effects $23</w:t>
+            <w:tcW w:type="dxa" w:w="1814"/>
+          </w:tcPr>
+          <w:p>
+            <w:pPr>
+              <w:spacing w:after="0"/>
+            </w:pPr>
+            <w:r>
+              <w:rPr>
+                <w:sz w:val="16"/>
+              </w:rPr>
+              <w:t>Adobe Firefly Services</w:t>
+            </w:r>
+          </w:p>
+        </w:tc>
+        <w:tc>
+          <w:tcPr>
+            <w:tcW w:type="dxa" w:w="5839"/>
+          </w:tcPr>
+          <w:p>
+            <w:pPr>
+              <w:spacing w:after="0"/>
+            </w:pPr>
+            <w:r>
+              <w:rPr>
+                <w:sz w:val="16"/>
+              </w:rPr>
+              <w:t>Firefly, Photoshop, InDesign, Lightroom, Content Tagging, Audio/Video APIs (enterprise agreement; price quoted by Adobe sales, third-party estimate about $1,000+ per month)</w:t>
             </w:r>
           </w:p>
         </w:tc>
@@ -5426,7 +5918,7 @@
               <w:rPr>
                 <w:sz w:val="16"/>
               </w:rPr>
-              <w:t>$152-341</w:t>
+              <w:t>about $1,000+</w:t>
             </w:r>
           </w:p>
         </w:tc>
@@ -5434,33 +5926,33 @@
       <w:tr>
         <w:tc>
           <w:tcPr>
-            <w:tcW w:type="dxa" w:w="1701"/>
-          </w:tcPr>
-          <w:p>
-            <w:pPr>
-              <w:spacing w:after="0"/>
-            </w:pPr>
-            <w:r>
-              <w:rPr>
-                <w:sz w:val="16"/>
-              </w:rPr>
-              <w:t>Music</w:t>
-            </w:r>
-          </w:p>
-        </w:tc>
-        <w:tc>
-          <w:tcPr>
-            <w:tcW w:type="dxa" w:w="5953"/>
-          </w:tcPr>
-          <w:p>
-            <w:pPr>
-              <w:spacing w:after="0"/>
-            </w:pPr>
-            <w:r>
-              <w:rPr>
-                <w:sz w:val="16"/>
-              </w:rPr>
-              <w:t>Epidemic Sound (or free YouTube Audio Library)</w:t>
+            <w:tcW w:type="dxa" w:w="1814"/>
+          </w:tcPr>
+          <w:p>
+            <w:pPr>
+              <w:spacing w:after="0"/>
+            </w:pPr>
+            <w:r>
+              <w:rPr>
+                <w:sz w:val="16"/>
+              </w:rPr>
+              <w:t>Motion video</w:t>
+            </w:r>
+          </w:p>
+        </w:tc>
+        <w:tc>
+          <w:tcPr>
+            <w:tcW w:type="dxa" w:w="5839"/>
+          </w:tcPr>
+          <w:p>
+            <w:pPr>
+              <w:spacing w:after="0"/>
+            </w:pPr>
+            <w:r>
+              <w:rPr>
+                <w:sz w:val="16"/>
+              </w:rPr>
+              <w:t>Creatomate $41-129, Plainly $69-150, After Effects $23</w:t>
             </w:r>
           </w:p>
         </w:tc>
@@ -5476,7 +5968,7 @@
               <w:rPr>
                 <w:sz w:val="16"/>
               </w:rPr>
-              <w:t>$0-75</w:t>
+              <w:t>$133-302</w:t>
             </w:r>
           </w:p>
         </w:tc>
@@ -5484,33 +5976,33 @@
       <w:tr>
         <w:tc>
           <w:tcPr>
-            <w:tcW w:type="dxa" w:w="1701"/>
-          </w:tcPr>
-          <w:p>
-            <w:pPr>
-              <w:spacing w:after="0"/>
-            </w:pPr>
-            <w:r>
-              <w:rPr>
-                <w:sz w:val="16"/>
-              </w:rPr>
-              <w:t>Storage</w:t>
-            </w:r>
-          </w:p>
-        </w:tc>
-        <w:tc>
-          <w:tcPr>
-            <w:tcW w:type="dxa" w:w="5953"/>
-          </w:tcPr>
-          <w:p>
-            <w:pPr>
-              <w:spacing w:after="0"/>
-            </w:pPr>
-            <w:r>
-              <w:rPr>
-                <w:sz w:val="16"/>
-              </w:rPr>
-              <w:t>MinIO on Coolify, extra disk and backup</w:t>
+            <w:tcW w:type="dxa" w:w="1814"/>
+          </w:tcPr>
+          <w:p>
+            <w:pPr>
+              <w:spacing w:after="0"/>
+            </w:pPr>
+            <w:r>
+              <w:rPr>
+                <w:sz w:val="16"/>
+              </w:rPr>
+              <w:t>Music</w:t>
+            </w:r>
+          </w:p>
+        </w:tc>
+        <w:tc>
+          <w:tcPr>
+            <w:tcW w:type="dxa" w:w="5839"/>
+          </w:tcPr>
+          <w:p>
+            <w:pPr>
+              <w:spacing w:after="0"/>
+            </w:pPr>
+            <w:r>
+              <w:rPr>
+                <w:sz w:val="16"/>
+              </w:rPr>
+              <w:t>Epidemic Sound (or free YouTube Audio Library)</w:t>
             </w:r>
           </w:p>
         </w:tc>
@@ -5526,7 +6018,7 @@
               <w:rPr>
                 <w:sz w:val="16"/>
               </w:rPr>
-              <w:t>$0-15</w:t>
+              <w:t>$0-75</w:t>
             </w:r>
           </w:p>
         </w:tc>
@@ -5534,33 +6026,33 @@
       <w:tr>
         <w:tc>
           <w:tcPr>
-            <w:tcW w:type="dxa" w:w="1701"/>
-          </w:tcPr>
-          <w:p>
-            <w:pPr>
-              <w:spacing w:after="0"/>
-            </w:pPr>
-            <w:r>
-              <w:rPr>
-                <w:sz w:val="16"/>
-              </w:rPr>
-              <w:t>Publishing</w:t>
-            </w:r>
-          </w:p>
-        </w:tc>
-        <w:tc>
-          <w:tcPr>
-            <w:tcW w:type="dxa" w:w="5953"/>
-          </w:tcPr>
-          <w:p>
-            <w:pPr>
-              <w:spacing w:after="0"/>
-            </w:pPr>
-            <w:r>
-              <w:rPr>
-                <w:sz w:val="16"/>
-              </w:rPr>
-              <w:t>Meta, LinkedIn, YouTube, Pinterest free; X pay-per-use</w:t>
+            <w:tcW w:type="dxa" w:w="1814"/>
+          </w:tcPr>
+          <w:p>
+            <w:pPr>
+              <w:spacing w:after="0"/>
+            </w:pPr>
+            <w:r>
+              <w:rPr>
+                <w:sz w:val="16"/>
+              </w:rPr>
+              <w:t>Storage</w:t>
+            </w:r>
+          </w:p>
+        </w:tc>
+        <w:tc>
+          <w:tcPr>
+            <w:tcW w:type="dxa" w:w="5839"/>
+          </w:tcPr>
+          <w:p>
+            <w:pPr>
+              <w:spacing w:after="0"/>
+            </w:pPr>
+            <w:r>
+              <w:rPr>
+                <w:sz w:val="16"/>
+              </w:rPr>
+              <w:t>MinIO on Coolify, extra disk and backup</w:t>
             </w:r>
           </w:p>
         </w:tc>
@@ -5576,7 +6068,7 @@
               <w:rPr>
                 <w:sz w:val="16"/>
               </w:rPr>
-              <w:t>$5-20</w:t>
+              <w:t>$0-15</w:t>
             </w:r>
           </w:p>
         </w:tc>
@@ -5584,33 +6076,33 @@
       <w:tr>
         <w:tc>
           <w:tcPr>
-            <w:tcW w:type="dxa" w:w="1701"/>
-          </w:tcPr>
-          <w:p>
-            <w:pPr>
-              <w:spacing w:after="0"/>
-            </w:pPr>
-            <w:r>
-              <w:rPr>
-                <w:sz w:val="16"/>
-              </w:rPr>
-              <w:t>Free / existing</w:t>
-            </w:r>
-          </w:p>
-        </w:tc>
-        <w:tc>
-          <w:tcPr>
-            <w:tcW w:type="dxa" w:w="5953"/>
-          </w:tcPr>
-          <w:p>
-            <w:pPr>
-              <w:spacing w:after="0"/>
-            </w:pPr>
-            <w:r>
-              <w:rPr>
-                <w:sz w:val="16"/>
-              </w:rPr>
-              <w:t>Unsplash, Fireflies, Zoho, SerpHouse, Google tools, WordPress, Slack, Canva, Coolify</w:t>
+            <w:tcW w:type="dxa" w:w="1814"/>
+          </w:tcPr>
+          <w:p>
+            <w:pPr>
+              <w:spacing w:after="0"/>
+            </w:pPr>
+            <w:r>
+              <w:rPr>
+                <w:sz w:val="16"/>
+              </w:rPr>
+              <w:t>Native posting APIs</w:t>
+            </w:r>
+          </w:p>
+        </w:tc>
+        <w:tc>
+          <w:tcPr>
+            <w:tcW w:type="dxa" w:w="5839"/>
+          </w:tcPr>
+          <w:p>
+            <w:pPr>
+              <w:spacing w:after="0"/>
+            </w:pPr>
+            <w:r>
+              <w:rPr>
+                <w:sz w:val="16"/>
+              </w:rPr>
+              <w:t>Meta, Instagram, Threads, LinkedIn, YouTube, Pinterest free; X pay-per-use</w:t>
             </w:r>
           </w:p>
         </w:tc>
@@ -5626,7 +6118,7 @@
               <w:rPr>
                 <w:sz w:val="16"/>
               </w:rPr>
-              <w:t>$0 extra</w:t>
+              <w:t>$5-20</w:t>
             </w:r>
           </w:p>
         </w:tc>
@@ -5634,33 +6126,33 @@
       <w:tr>
         <w:tc>
           <w:tcPr>
-            <w:tcW w:type="dxa" w:w="1701"/>
-          </w:tcPr>
-          <w:p>
-            <w:pPr>
-              <w:spacing w:after="0"/>
-            </w:pPr>
-            <w:r>
-              <w:rPr>
-                <w:sz w:val="16"/>
-              </w:rPr>
-              <w:t>TOTAL</w:t>
-            </w:r>
-          </w:p>
-        </w:tc>
-        <w:tc>
-          <w:tcPr>
-            <w:tcW w:type="dxa" w:w="5953"/>
-          </w:tcPr>
-          <w:p>
-            <w:pPr>
-              <w:spacing w:after="0"/>
-            </w:pPr>
-            <w:r>
-              <w:rPr>
-                <w:sz w:val="16"/>
-              </w:rPr>
-              <w:t>All new tools together</w:t>
+            <w:tcW w:type="dxa" w:w="1814"/>
+          </w:tcPr>
+          <w:p>
+            <w:pPr>
+              <w:spacing w:after="0"/>
+            </w:pPr>
+            <w:r>
+              <w:rPr>
+                <w:sz w:val="16"/>
+              </w:rPr>
+              <w:t>Free / existing</w:t>
+            </w:r>
+          </w:p>
+        </w:tc>
+        <w:tc>
+          <w:tcPr>
+            <w:tcW w:type="dxa" w:w="5839"/>
+          </w:tcPr>
+          <w:p>
+            <w:pPr>
+              <w:spacing w:after="0"/>
+            </w:pPr>
+            <w:r>
+              <w:rPr>
+                <w:sz w:val="16"/>
+              </w:rPr>
+              <w:t>Fireflies, Zoho, SerpHouse, Google tools, WordPress, Slack, Canva, Coolify</w:t>
             </w:r>
           </w:p>
         </w:tc>
@@ -5676,128 +6168,7 @@
               <w:rPr>
                 <w:sz w:val="16"/>
               </w:rPr>
-              <w:t>about $250-680</w:t>
-            </w:r>
-          </w:p>
-        </w:tc>
-      </w:tr>
-    </w:tbl>
-    <w:p>
-      <w:pPr>
-        <w:spacing w:before="100" w:after="40"/>
-      </w:pPr>
-      <w:r>
-        <w:rPr>
-          <w:b/>
-          <w:color w:val="1B2A5E"/>
-          <w:sz w:val="22"/>
-        </w:rPr>
-        <w:t>8. Option: Adobe Firefly Services (what it includes, what it replaces, cost)</w:t>
-      </w:r>
-    </w:p>
-    <w:p>
-      <w:r>
-        <w:t>Firefly Services is Adobe's set of creative APIs, sold only under an Adobe enterprise agreement (ETLA). Price is quoted by Adobe sales; third-party estimates suggest about $1,000 per month minimum. Website: developer.adobe.com/firefly-services</w:t>
-      </w:r>
-    </w:p>
-    <w:tbl>
-      <w:tblPr>
-        <w:tblStyle w:val="LightGrid-Accent1"/>
-        <w:tblW w:type="auto" w:w="0"/>
-        <w:tblLook w:firstColumn="1" w:firstRow="1" w:lastColumn="0" w:lastRow="0" w:noHBand="0" w:noVBand="1" w:val="04A0"/>
-      </w:tblPr>
-      <w:tblGrid>
-        <w:gridCol w:w="2635"/>
-        <w:gridCol w:w="2635"/>
-        <w:gridCol w:w="2635"/>
-        <w:gridCol w:w="2635"/>
-      </w:tblGrid>
-      <w:tr>
-        <w:tc>
-          <w:tcPr>
-            <w:tcW w:type="dxa" w:w="2268"/>
-          </w:tcPr>
-          <w:p>
-            <w:pPr>
-              <w:spacing w:after="0"/>
-            </w:pPr>
-            <w:r>
-              <w:rPr>
-                <w:sz w:val="16"/>
-              </w:rPr>
-            </w:r>
-            <w:r>
-              <w:rPr>
-                <w:b/>
-                <w:sz w:val="16"/>
-              </w:rPr>
-              <w:t>Firefly Services API</w:t>
-            </w:r>
-          </w:p>
-        </w:tc>
-        <w:tc>
-          <w:tcPr>
-            <w:tcW w:type="dxa" w:w="3402"/>
-          </w:tcPr>
-          <w:p>
-            <w:pPr>
-              <w:spacing w:after="0"/>
-            </w:pPr>
-            <w:r>
-              <w:rPr>
-                <w:sz w:val="16"/>
-              </w:rPr>
-            </w:r>
-            <w:r>
-              <w:rPr>
-                <w:b/>
-                <w:sz w:val="16"/>
-              </w:rPr>
-              <w:t>Use case for us</w:t>
-            </w:r>
-          </w:p>
-        </w:tc>
-        <w:tc>
-          <w:tcPr>
-            <w:tcW w:type="dxa" w:w="2551"/>
-          </w:tcPr>
-          <w:p>
-            <w:pPr>
-              <w:spacing w:after="0"/>
-            </w:pPr>
-            <w:r>
-              <w:rPr>
-                <w:sz w:val="16"/>
-              </w:rPr>
-            </w:r>
-            <w:r>
-              <w:rPr>
-                <w:b/>
-                <w:sz w:val="16"/>
-              </w:rPr>
-              <w:t>Would replace</w:t>
-            </w:r>
-          </w:p>
-        </w:tc>
-        <w:tc>
-          <w:tcPr>
-            <w:tcW w:type="dxa" w:w="1417"/>
-          </w:tcPr>
-          <w:p>
-            <w:pPr>
-              <w:spacing w:after="0"/>
-            </w:pPr>
-            <w:r>
-              <w:rPr>
-                <w:sz w:val="16"/>
-              </w:rPr>
-            </w:r>
-            <w:r>
-              <w:rPr>
-                <w:b/>
-                <w:sz w:val="16"/>
-              </w:rPr>
-              <w:t>Saving</w:t>
+              <w:t>$0 extra</w:t>
             </w:r>
           </w:p>
         </w:tc>
@@ -5805,883 +6176,49 @@
       <w:tr>
         <w:tc>
           <w:tcPr>
-            <w:tcW w:type="dxa" w:w="2268"/>
-          </w:tcPr>
-          <w:p>
-            <w:pPr>
-              <w:spacing w:after="0"/>
-            </w:pPr>
-            <w:r>
-              <w:rPr>
-                <w:sz w:val="16"/>
-              </w:rPr>
-              <w:t>Firefly API (image generation, fill, expand)</w:t>
-            </w:r>
-          </w:p>
-        </w:tc>
-        <w:tc>
-          <w:tcPr>
-            <w:tcW w:type="dxa" w:w="3402"/>
-          </w:tcPr>
-          <w:p>
-            <w:pPr>
-              <w:spacing w:after="0"/>
-            </w:pPr>
-            <w:r>
-              <w:rPr>
-                <w:sz w:val="16"/>
-              </w:rPr>
-              <w:t>Concept images, backgrounds, edit by prompt; marketed as commercially safe</w:t>
-            </w:r>
-          </w:p>
-        </w:tc>
-        <w:tc>
-          <w:tcPr>
-            <w:tcW w:type="dxa" w:w="2551"/>
-          </w:tcPr>
-          <w:p>
-            <w:pPr>
-              <w:spacing w:after="0"/>
-            </w:pPr>
-            <w:r>
-              <w:rPr>
-                <w:sz w:val="16"/>
-              </w:rPr>
-              <w:t>OpenAI images (we keep OpenAI for second fact check)</w:t>
-            </w:r>
-          </w:p>
-        </w:tc>
-        <w:tc>
-          <w:tcPr>
-            <w:tcW w:type="dxa" w:w="1417"/>
-          </w:tcPr>
-          <w:p>
-            <w:pPr>
-              <w:spacing w:after="0"/>
-            </w:pPr>
-            <w:r>
-              <w:rPr>
-                <w:sz w:val="16"/>
-              </w:rPr>
-              <w:t>$20-50</w:t>
-            </w:r>
-          </w:p>
-        </w:tc>
-      </w:tr>
-      <w:tr>
-        <w:tc>
-          <w:tcPr>
-            <w:tcW w:type="dxa" w:w="2268"/>
-          </w:tcPr>
-          <w:p>
-            <w:pPr>
-              <w:spacing w:after="0"/>
-            </w:pPr>
-            <w:r>
-              <w:rPr>
-                <w:sz w:val="16"/>
-              </w:rPr>
-              <w:t>Photoshop API</w:t>
-            </w:r>
-          </w:p>
-        </w:tc>
-        <w:tc>
-          <w:tcPr>
-            <w:tcW w:type="dxa" w:w="3402"/>
-          </w:tcPr>
-          <w:p>
-            <w:pPr>
-              <w:spacing w:after="0"/>
-            </w:pPr>
-            <w:r>
-              <w:rPr>
-                <w:sz w:val="16"/>
-              </w:rPr>
-              <w:t>Fill PSD brand templates, remove backgrounds, resize for every platform</w:t>
-            </w:r>
-          </w:p>
-        </w:tc>
-        <w:tc>
-          <w:tcPr>
-            <w:tcW w:type="dxa" w:w="2551"/>
-          </w:tcPr>
-          <w:p>
-            <w:pPr>
-              <w:spacing w:after="0"/>
-            </w:pPr>
-            <w:r>
-              <w:rPr>
-                <w:sz w:val="16"/>
-              </w:rPr>
-              <w:t>Placid</w:t>
-            </w:r>
-          </w:p>
-        </w:tc>
-        <w:tc>
-          <w:tcPr>
-            <w:tcW w:type="dxa" w:w="1417"/>
-          </w:tcPr>
-          <w:p>
-            <w:pPr>
-              <w:spacing w:after="0"/>
-            </w:pPr>
-            <w:r>
-              <w:rPr>
-                <w:sz w:val="16"/>
-              </w:rPr>
-              <w:t>$19-39</w:t>
-            </w:r>
-          </w:p>
-        </w:tc>
-      </w:tr>
-      <w:tr>
-        <w:tc>
-          <w:tcPr>
-            <w:tcW w:type="dxa" w:w="2268"/>
-          </w:tcPr>
-          <w:p>
-            <w:pPr>
-              <w:spacing w:after="0"/>
-            </w:pPr>
-            <w:r>
-              <w:rPr>
-                <w:sz w:val="16"/>
-              </w:rPr>
-              <w:t>InDesign API</w:t>
-            </w:r>
-          </w:p>
-        </w:tc>
-        <w:tc>
-          <w:tcPr>
-            <w:tcW w:type="dxa" w:w="3402"/>
-          </w:tcPr>
-          <w:p>
-            <w:pPr>
-              <w:spacing w:after="0"/>
-            </w:pPr>
-            <w:r>
-              <w:rPr>
-                <w:sz w:val="16"/>
-              </w:rPr>
-              <w:t>Multi-page layouts, carousels, PDFs and guides from templates</w:t>
-            </w:r>
-          </w:p>
-        </w:tc>
-        <w:tc>
-          <w:tcPr>
-            <w:tcW w:type="dxa" w:w="2551"/>
-          </w:tcPr>
-          <w:p>
-            <w:pPr>
-              <w:spacing w:after="0"/>
-            </w:pPr>
-            <w:r>
-              <w:rPr>
-                <w:sz w:val="16"/>
-              </w:rPr>
-              <w:t>Placid (carousels)</w:t>
-            </w:r>
-          </w:p>
-        </w:tc>
-        <w:tc>
-          <w:tcPr>
-            <w:tcW w:type="dxa" w:w="1417"/>
-          </w:tcPr>
-          <w:p>
-            <w:pPr>
-              <w:spacing w:after="0"/>
-            </w:pPr>
-            <w:r>
-              <w:rPr>
-                <w:sz w:val="16"/>
-              </w:rPr>
-              <w:t>Included above</w:t>
-            </w:r>
-          </w:p>
-        </w:tc>
-      </w:tr>
-      <w:tr>
-        <w:tc>
-          <w:tcPr>
-            <w:tcW w:type="dxa" w:w="2268"/>
-          </w:tcPr>
-          <w:p>
-            <w:pPr>
-              <w:spacing w:after="0"/>
-            </w:pPr>
-            <w:r>
-              <w:rPr>
-                <w:sz w:val="16"/>
-              </w:rPr>
-              <w:t>Lightroom API</w:t>
-            </w:r>
-          </w:p>
-        </w:tc>
-        <w:tc>
-          <w:tcPr>
-            <w:tcW w:type="dxa" w:w="3402"/>
-          </w:tcPr>
-          <w:p>
-            <w:pPr>
-              <w:spacing w:after="0"/>
-            </w:pPr>
-            <w:r>
-              <w:rPr>
-                <w:sz w:val="16"/>
-              </w:rPr>
-              <w:t>Auto colour and light correction for uploaded event photos</w:t>
-            </w:r>
-          </w:p>
-        </w:tc>
-        <w:tc>
-          <w:tcPr>
-            <w:tcW w:type="dxa" w:w="2551"/>
-          </w:tcPr>
-          <w:p>
-            <w:pPr>
-              <w:spacing w:after="0"/>
-            </w:pPr>
-            <w:r>
-              <w:rPr>
-                <w:sz w:val="16"/>
-              </w:rPr>
-              <w:t>Manual photo editing</w:t>
-            </w:r>
-          </w:p>
-        </w:tc>
-        <w:tc>
-          <w:tcPr>
-            <w:tcW w:type="dxa" w:w="1417"/>
-          </w:tcPr>
-          <w:p>
-            <w:pPr>
-              <w:spacing w:after="0"/>
-            </w:pPr>
-            <w:r>
-              <w:rPr>
-                <w:sz w:val="16"/>
-              </w:rPr>
-              <w:t>$0 (time saving)</w:t>
-            </w:r>
-          </w:p>
-        </w:tc>
-      </w:tr>
-      <w:tr>
-        <w:tc>
-          <w:tcPr>
-            <w:tcW w:type="dxa" w:w="2268"/>
-          </w:tcPr>
-          <w:p>
-            <w:pPr>
-              <w:spacing w:after="0"/>
-            </w:pPr>
-            <w:r>
-              <w:rPr>
-                <w:sz w:val="16"/>
-              </w:rPr>
-              <w:t>Content Tagging API</w:t>
-            </w:r>
-          </w:p>
-        </w:tc>
-        <w:tc>
-          <w:tcPr>
-            <w:tcW w:type="dxa" w:w="3402"/>
-          </w:tcPr>
-          <w:p>
-            <w:pPr>
-              <w:spacing w:after="0"/>
-            </w:pPr>
-            <w:r>
-              <w:rPr>
-                <w:sz w:val="16"/>
-              </w:rPr>
-              <w:t>Auto-tags every file in the Asset Library</w:t>
-            </w:r>
-          </w:p>
-        </w:tc>
-        <w:tc>
-          <w:tcPr>
-            <w:tcW w:type="dxa" w:w="2551"/>
-          </w:tcPr>
-          <w:p>
-            <w:pPr>
-              <w:spacing w:after="0"/>
-            </w:pPr>
-            <w:r>
-              <w:rPr>
-                <w:sz w:val="16"/>
-              </w:rPr>
-              <w:t>Nothing paid (Claude can tag files too)</w:t>
-            </w:r>
-          </w:p>
-        </w:tc>
-        <w:tc>
-          <w:tcPr>
-            <w:tcW w:type="dxa" w:w="1417"/>
-          </w:tcPr>
-          <w:p>
-            <w:pPr>
-              <w:spacing w:after="0"/>
-            </w:pPr>
-            <w:r>
-              <w:rPr>
-                <w:sz w:val="16"/>
-              </w:rPr>
-              <w:t>$0</w:t>
-            </w:r>
-          </w:p>
-        </w:tc>
-      </w:tr>
-      <w:tr>
-        <w:tc>
-          <w:tcPr>
-            <w:tcW w:type="dxa" w:w="2268"/>
-          </w:tcPr>
-          <w:p>
-            <w:pPr>
-              <w:spacing w:after="0"/>
-            </w:pPr>
-            <w:r>
-              <w:rPr>
-                <w:sz w:val="16"/>
-              </w:rPr>
-              <w:t>Audio / Video APIs</w:t>
-            </w:r>
-          </w:p>
-        </w:tc>
-        <w:tc>
-          <w:tcPr>
-            <w:tcW w:type="dxa" w:w="3402"/>
-          </w:tcPr>
-          <w:p>
-            <w:pPr>
-              <w:spacing w:after="0"/>
-            </w:pPr>
-            <w:r>
-              <w:rPr>
-                <w:sz w:val="16"/>
-              </w:rPr>
-              <w:t>Translate, dub and edit clips; AI video clips</w:t>
-            </w:r>
-          </w:p>
-        </w:tc>
-        <w:tc>
-          <w:tcPr>
-            <w:tcW w:type="dxa" w:w="2551"/>
-          </w:tcPr>
-          <w:p>
-            <w:pPr>
-              <w:spacing w:after="0"/>
-            </w:pPr>
-            <w:r>
-              <w:rPr>
-                <w:sz w:val="16"/>
-              </w:rPr>
-              <w:t>Partly the AI video clips only</w:t>
-            </w:r>
-          </w:p>
-        </w:tc>
-        <w:tc>
-          <w:tcPr>
-            <w:tcW w:type="dxa" w:w="1417"/>
-          </w:tcPr>
-          <w:p>
-            <w:pPr>
-              <w:spacing w:after="0"/>
-            </w:pPr>
-            <w:r>
-              <w:rPr>
-                <w:sz w:val="16"/>
-              </w:rPr>
-              <w:t>$0-small</w:t>
-            </w:r>
-          </w:p>
-        </w:tc>
-      </w:tr>
-    </w:tbl>
-    <w:tbl>
-      <w:tblPr>
-        <w:tblStyle w:val="LightGrid-Accent1"/>
-        <w:tblW w:type="auto" w:w="0"/>
-        <w:tblLook w:firstColumn="1" w:firstRow="1" w:lastColumn="0" w:lastRow="0" w:noHBand="0" w:noVBand="1" w:val="04A0"/>
-      </w:tblPr>
-      <w:tblGrid>
-        <w:gridCol w:w="5270"/>
-        <w:gridCol w:w="5270"/>
-      </w:tblGrid>
-      <w:tr>
-        <w:tc>
-          <w:tcPr>
-            <w:tcW w:type="dxa" w:w="3402"/>
-          </w:tcPr>
-          <w:p>
-            <w:pPr>
-              <w:spacing w:after="0"/>
-            </w:pPr>
-            <w:r>
-              <w:rPr>
-                <w:sz w:val="16"/>
-              </w:rPr>
-            </w:r>
-            <w:r>
-              <w:rPr>
-                <w:b/>
-                <w:sz w:val="16"/>
-              </w:rPr>
-              <w:t>What Firefly Services does NOT replace</w:t>
-            </w:r>
-          </w:p>
-        </w:tc>
-        <w:tc>
-          <w:tcPr>
-            <w:tcW w:type="dxa" w:w="6236"/>
-          </w:tcPr>
-          <w:p>
-            <w:pPr>
-              <w:spacing w:after="0"/>
-            </w:pPr>
-            <w:r>
-              <w:rPr>
-                <w:sz w:val="16"/>
-              </w:rPr>
-            </w:r>
-            <w:r>
-              <w:rPr>
-                <w:b/>
-                <w:sz w:val="16"/>
-              </w:rPr>
-              <w:t>Why we still need it</w:t>
-            </w:r>
-          </w:p>
-        </w:tc>
-      </w:tr>
-      <w:tr>
-        <w:tc>
-          <w:tcPr>
-            <w:tcW w:type="dxa" w:w="3402"/>
-          </w:tcPr>
-          <w:p>
-            <w:pPr>
-              <w:spacing w:after="0"/>
-            </w:pPr>
-            <w:r>
-              <w:rPr>
-                <w:sz w:val="16"/>
-              </w:rPr>
-              <w:t>Zoho CRM</w:t>
-            </w:r>
-          </w:p>
-        </w:tc>
-        <w:tc>
-          <w:tcPr>
-            <w:tcW w:type="dxa" w:w="6236"/>
-          </w:tcPr>
-          <w:p>
-            <w:pPr>
-              <w:spacing w:after="0"/>
-            </w:pPr>
-            <w:r>
-              <w:rPr>
-                <w:sz w:val="16"/>
-              </w:rPr>
-              <w:t>Lead tracking and sales pipeline; Firefly has no CRM</w:t>
-            </w:r>
-          </w:p>
-        </w:tc>
-      </w:tr>
-      <w:tr>
-        <w:tc>
-          <w:tcPr>
-            <w:tcW w:type="dxa" w:w="3402"/>
-          </w:tcPr>
-          <w:p>
-            <w:pPr>
-              <w:spacing w:after="0"/>
-            </w:pPr>
-            <w:r>
-              <w:rPr>
-                <w:sz w:val="16"/>
-              </w:rPr>
-              <w:t>Fireflies.ai</w:t>
-            </w:r>
-          </w:p>
-        </w:tc>
-        <w:tc>
-          <w:tcPr>
-            <w:tcW w:type="dxa" w:w="6236"/>
-          </w:tcPr>
-          <w:p>
-            <w:pPr>
-              <w:spacing w:after="0"/>
-            </w:pPr>
-            <w:r>
-              <w:rPr>
-                <w:sz w:val="16"/>
-              </w:rPr>
-              <w:t>Meeting transcripts; different product, not related to Adobe Firefly</w:t>
-            </w:r>
-          </w:p>
-        </w:tc>
-      </w:tr>
-      <w:tr>
-        <w:tc>
-          <w:tcPr>
-            <w:tcW w:type="dxa" w:w="3402"/>
-          </w:tcPr>
-          <w:p>
-            <w:pPr>
-              <w:spacing w:after="0"/>
-            </w:pPr>
-            <w:r>
-              <w:rPr>
-                <w:sz w:val="16"/>
-              </w:rPr>
-              <w:t>Claude, Grok, OpenAI (text)</w:t>
-            </w:r>
-          </w:p>
-        </w:tc>
-        <w:tc>
-          <w:tcPr>
-            <w:tcW w:type="dxa" w:w="6236"/>
-          </w:tcPr>
-          <w:p>
-            <w:pPr>
-              <w:spacing w:after="0"/>
-            </w:pPr>
-            <w:r>
-              <w:rPr>
-                <w:sz w:val="16"/>
-              </w:rPr>
-              <w:t>Research, writing, fact check, trends, replies</w:t>
-            </w:r>
-          </w:p>
-        </w:tc>
-      </w:tr>
-      <w:tr>
-        <w:tc>
-          <w:tcPr>
-            <w:tcW w:type="dxa" w:w="3402"/>
-          </w:tcPr>
-          <w:p>
-            <w:pPr>
-              <w:spacing w:after="0"/>
-            </w:pPr>
-            <w:r>
-              <w:rPr>
-                <w:sz w:val="16"/>
-              </w:rPr>
-              <w:t>Creatomate, Plainly, After Effects</w:t>
-            </w:r>
-          </w:p>
-        </w:tc>
-        <w:tc>
-          <w:tcPr>
-            <w:tcW w:type="dxa" w:w="6236"/>
-          </w:tcPr>
-          <w:p>
-            <w:pPr>
-              <w:spacing w:after="0"/>
-            </w:pPr>
-            <w:r>
-              <w:rPr>
-                <w:sz w:val="16"/>
-              </w:rPr>
-              <w:t>Motion graphics templates and After Effects quality rendering</w:t>
-            </w:r>
-          </w:p>
-        </w:tc>
-      </w:tr>
-      <w:tr>
-        <w:tc>
-          <w:tcPr>
-            <w:tcW w:type="dxa" w:w="3402"/>
-          </w:tcPr>
-          <w:p>
-            <w:pPr>
-              <w:spacing w:after="0"/>
-            </w:pPr>
-            <w:r>
-              <w:rPr>
-                <w:sz w:val="16"/>
-              </w:rPr>
-              <w:t>Epidemic Sound</w:t>
-            </w:r>
-          </w:p>
-        </w:tc>
-        <w:tc>
-          <w:tcPr>
-            <w:tcW w:type="dxa" w:w="6236"/>
-          </w:tcPr>
-          <w:p>
-            <w:pPr>
-              <w:spacing w:after="0"/>
-            </w:pPr>
-            <w:r>
-              <w:rPr>
-                <w:sz w:val="16"/>
-              </w:rPr>
-              <w:t>Licensed music library</w:t>
-            </w:r>
-          </w:p>
-        </w:tc>
-      </w:tr>
-      <w:tr>
-        <w:tc>
-          <w:tcPr>
-            <w:tcW w:type="dxa" w:w="3402"/>
-          </w:tcPr>
-          <w:p>
-            <w:pPr>
-              <w:spacing w:after="0"/>
-            </w:pPr>
-            <w:r>
-              <w:rPr>
-                <w:sz w:val="16"/>
-              </w:rPr>
-              <w:t>Native platform APIs</w:t>
-            </w:r>
-          </w:p>
-        </w:tc>
-        <w:tc>
-          <w:tcPr>
-            <w:tcW w:type="dxa" w:w="6236"/>
-          </w:tcPr>
-          <w:p>
-            <w:pPr>
-              <w:spacing w:after="0"/>
-            </w:pPr>
-            <w:r>
-              <w:rPr>
-                <w:sz w:val="16"/>
-              </w:rPr>
-              <w:t>Posting to Meta, LinkedIn, YouTube, Pinterest, X</w:t>
-            </w:r>
-          </w:p>
-        </w:tc>
-      </w:tr>
-      <w:tr>
-        <w:tc>
-          <w:tcPr>
-            <w:tcW w:type="dxa" w:w="3402"/>
-          </w:tcPr>
-          <w:p>
-            <w:pPr>
-              <w:spacing w:after="0"/>
-            </w:pPr>
-            <w:r>
-              <w:rPr>
-                <w:sz w:val="16"/>
-              </w:rPr>
-              <w:t>MinIO, Coolify, PostgreSQL</w:t>
-            </w:r>
-          </w:p>
-        </w:tc>
-        <w:tc>
-          <w:tcPr>
-            <w:tcW w:type="dxa" w:w="6236"/>
-          </w:tcPr>
-          <w:p>
-            <w:pPr>
-              <w:spacing w:after="0"/>
-            </w:pPr>
-            <w:r>
-              <w:rPr>
-                <w:sz w:val="16"/>
-              </w:rPr>
-              <w:t>Storage, hosting, database</w:t>
-            </w:r>
-          </w:p>
-        </w:tc>
-      </w:tr>
-    </w:tbl>
-    <w:tbl>
-      <w:tblPr>
-        <w:tblStyle w:val="LightGrid-Accent1"/>
-        <w:tblW w:type="auto" w:w="0"/>
-        <w:tblLook w:firstColumn="1" w:firstRow="1" w:lastColumn="0" w:lastRow="0" w:noHBand="0" w:noVBand="1" w:val="04A0"/>
-      </w:tblPr>
-      <w:tblGrid>
-        <w:gridCol w:w="5270"/>
-        <w:gridCol w:w="5270"/>
-      </w:tblGrid>
-      <w:tr>
-        <w:tc>
-          <w:tcPr>
-            <w:tcW w:type="dxa" w:w="6803"/>
-          </w:tcPr>
-          <w:p>
-            <w:pPr>
-              <w:spacing w:after="0"/>
-            </w:pPr>
-            <w:r>
-              <w:rPr>
-                <w:sz w:val="16"/>
-              </w:rPr>
-            </w:r>
-            <w:r>
-              <w:rPr>
-                <w:b/>
-                <w:sz w:val="16"/>
-              </w:rPr>
-              <w:t>Comparison</w:t>
-            </w:r>
-          </w:p>
-        </w:tc>
-        <w:tc>
-          <w:tcPr>
-            <w:tcW w:type="dxa" w:w="2835"/>
-          </w:tcPr>
-          <w:p>
-            <w:pPr>
-              <w:spacing w:after="0"/>
-            </w:pPr>
-            <w:r>
-              <w:rPr>
-                <w:sz w:val="16"/>
-              </w:rPr>
-            </w:r>
-            <w:r>
-              <w:rPr>
-                <w:b/>
-                <w:sz w:val="16"/>
-              </w:rPr>
-              <w:t>Approx. per month</w:t>
-            </w:r>
-          </w:p>
-        </w:tc>
-      </w:tr>
-      <w:tr>
-        <w:tc>
-          <w:tcPr>
-            <w:tcW w:type="dxa" w:w="6803"/>
-          </w:tcPr>
-          <w:p>
-            <w:pPr>
-              <w:spacing w:after="0"/>
-            </w:pPr>
-            <w:r>
-              <w:rPr>
-                <w:sz w:val="16"/>
-              </w:rPr>
-              <w:t>Tools Firefly Services could replace (Placid + OpenAI images)</w:t>
-            </w:r>
-          </w:p>
-        </w:tc>
-        <w:tc>
-          <w:tcPr>
-            <w:tcW w:type="dxa" w:w="2835"/>
-          </w:tcPr>
-          <w:p>
-            <w:pPr>
-              <w:spacing w:after="0"/>
-            </w:pPr>
-            <w:r>
-              <w:rPr>
-                <w:sz w:val="16"/>
-              </w:rPr>
-              <w:t>$40-90</w:t>
-            </w:r>
-          </w:p>
-        </w:tc>
-      </w:tr>
-      <w:tr>
-        <w:tc>
-          <w:tcPr>
-            <w:tcW w:type="dxa" w:w="6803"/>
-          </w:tcPr>
-          <w:p>
-            <w:pPr>
-              <w:spacing w:after="0"/>
-            </w:pPr>
-            <w:r>
-              <w:rPr>
-                <w:sz w:val="16"/>
-              </w:rPr>
-              <w:t>Firefly Services (enterprise, estimate)</w:t>
-            </w:r>
-          </w:p>
-        </w:tc>
-        <w:tc>
-          <w:tcPr>
-            <w:tcW w:type="dxa" w:w="2835"/>
-          </w:tcPr>
-          <w:p>
-            <w:pPr>
-              <w:spacing w:after="0"/>
-            </w:pPr>
-            <w:r>
-              <w:rPr>
-                <w:sz w:val="16"/>
-              </w:rPr>
-              <w:t>about $1,000+ (quote only)</w:t>
-            </w:r>
-          </w:p>
-        </w:tc>
-      </w:tr>
-      <w:tr>
-        <w:tc>
-          <w:tcPr>
-            <w:tcW w:type="dxa" w:w="6803"/>
-          </w:tcPr>
-          <w:p>
-            <w:pPr>
-              <w:spacing w:after="0"/>
-            </w:pPr>
-            <w:r>
-              <w:rPr>
-                <w:sz w:val="16"/>
-              </w:rPr>
-              <w:t>Plan total WITHOUT Firefly Services</w:t>
-            </w:r>
-          </w:p>
-        </w:tc>
-        <w:tc>
-          <w:tcPr>
-            <w:tcW w:type="dxa" w:w="2835"/>
-          </w:tcPr>
-          <w:p>
-            <w:pPr>
-              <w:spacing w:after="0"/>
-            </w:pPr>
-            <w:r>
-              <w:rPr>
-                <w:sz w:val="16"/>
-              </w:rPr>
-              <w:t>about $250-680</w:t>
-            </w:r>
-          </w:p>
-        </w:tc>
-      </w:tr>
-      <w:tr>
-        <w:tc>
-          <w:tcPr>
-            <w:tcW w:type="dxa" w:w="6803"/>
-          </w:tcPr>
-          <w:p>
-            <w:pPr>
-              <w:spacing w:after="0"/>
-            </w:pPr>
-            <w:r>
-              <w:rPr>
-                <w:sz w:val="16"/>
-              </w:rPr>
-              <w:t>Plan total WITH Firefly Services (minus replaced tools)</w:t>
-            </w:r>
-          </w:p>
-        </w:tc>
-        <w:tc>
-          <w:tcPr>
-            <w:tcW w:type="dxa" w:w="2835"/>
-          </w:tcPr>
-          <w:p>
-            <w:pPr>
-              <w:spacing w:after="0"/>
-            </w:pPr>
-            <w:r>
-              <w:rPr>
-                <w:sz w:val="16"/>
-              </w:rPr>
-              <w:t>about $1,160-1,640+</w:t>
+            <w:tcW w:type="dxa" w:w="1814"/>
+          </w:tcPr>
+          <w:p>
+            <w:pPr>
+              <w:spacing w:after="0"/>
+            </w:pPr>
+            <w:r>
+              <w:rPr>
+                <w:sz w:val="16"/>
+              </w:rPr>
+              <w:t>TOTAL</w:t>
+            </w:r>
+          </w:p>
+        </w:tc>
+        <w:tc>
+          <w:tcPr>
+            <w:tcW w:type="dxa" w:w="5839"/>
+          </w:tcPr>
+          <w:p>
+            <w:pPr>
+              <w:spacing w:after="0"/>
+            </w:pPr>
+            <w:r>
+              <w:rPr>
+                <w:sz w:val="16"/>
+              </w:rPr>
+              <w:t>All new tools together</w:t>
+            </w:r>
+          </w:p>
+        </w:tc>
+        <w:tc>
+          <w:tcPr>
+            <w:tcW w:type="dxa" w:w="1984"/>
+          </w:tcPr>
+          <w:p>
+            <w:pPr>
+              <w:spacing w:after="0"/>
+            </w:pPr>
+            <w:r>
+              <w:rPr>
+                <w:sz w:val="16"/>
+              </w:rPr>
+              <w:t>about $1,220-1,610+ (final figure depends on Adobe's quote)</w:t>
             </w:r>
           </w:p>
         </w:tc>
@@ -6689,7 +6226,7 @@
     </w:tbl>
     <w:p>
       <w:r>
-        <w:t>Recommendation: not now. Firefly Services costs much more than the tools it replaces at our volume. Ask Adobe sales for a small-volume quote (Photoshop + Firefly APIs only); if it is under about $150 per month, switch Placid and OpenAI images to Firefly.</w:t>
+        <w:t>Next step: request a Firefly Services quote from Adobe sales (developer.adobe.com/firefly-services) and replace the estimate above with the real price.</w:t>
       </w:r>
     </w:p>
     <w:sectPr>

</xml_diff>